<commit_message>
Update gitignore and lecture notes
</commit_message>
<xml_diff>
--- a/week5/L11.docx
+++ b/week5/L11.docx
@@ -19,7 +19,2510 @@
         <w:t>CONVERSATIONAL AI</w:t>
       </w:r>
     </w:p>
+    <w:p>
+      <w:r>
+        <w:t xml:space="preserve">Dialog systems –&gt; </w:t>
+      </w:r>
+    </w:p>
+    <w:p>
+      <w:r>
+        <w:t>task-oriented</w:t>
+      </w:r>
+    </w:p>
+    <w:p>
+      <w:r>
+        <w:t xml:space="preserve">non-task oriented </w:t>
+      </w:r>
+    </w:p>
     <w:p/>
+    <w:p>
+      <w:r>
+        <w:t xml:space="preserve">Main challenges include </w:t>
+      </w:r>
+      <w:r>
+        <w:t>:</w:t>
+      </w:r>
+    </w:p>
+    <w:p>
+      <w:r>
+        <w:t xml:space="preserve">- </w:t>
+      </w:r>
+      <w:r>
+        <w:t>variations in the language</w:t>
+      </w:r>
+      <w:r>
+        <w:t xml:space="preserve"> </w:t>
+      </w:r>
+      <w:r>
+        <w:t>(e.g., dialects, accents to sarcasm, emoji,</w:t>
+      </w:r>
+      <w:proofErr w:type="gramStart"/>
+      <w:r>
+        <w:t xml:space="preserve"> ,..</w:t>
+      </w:r>
+      <w:proofErr w:type="gramEnd"/>
+      <w:r>
+        <w:t xml:space="preserve">) </w:t>
+      </w:r>
+    </w:p>
+    <w:p>
+      <w:r>
+        <w:t xml:space="preserve">- </w:t>
+      </w:r>
+      <w:r>
+        <w:t xml:space="preserve">Low Conversation-Turn Per Session (CPS) </w:t>
+      </w:r>
+    </w:p>
+    <w:p>
+      <w:r>
+        <w:t xml:space="preserve">- </w:t>
+      </w:r>
+      <w:r>
+        <w:t>high</w:t>
+      </w:r>
+      <w:r>
+        <w:t xml:space="preserve"> </w:t>
+      </w:r>
+      <w:r>
+        <w:t>latency between consecutive answering states</w:t>
+      </w:r>
+    </w:p>
+    <w:p>
+      <w:r>
+        <w:t xml:space="preserve">- </w:t>
+      </w:r>
+      <w:r>
+        <w:t>Security and Privacy</w:t>
+      </w:r>
+    </w:p>
+    <w:p>
+      <w:r>
+        <w:t xml:space="preserve">- </w:t>
+      </w:r>
+      <w:r>
+        <w:t>adoption by those who do</w:t>
+      </w:r>
+      <w:r>
+        <w:t xml:space="preserve"> </w:t>
+      </w:r>
+      <w:r>
+        <w:t xml:space="preserve">not feel comfortable interacting with conversational agents. </w:t>
+      </w:r>
+    </w:p>
+    <w:p/>
+    <w:p>
+      <w:r>
+        <w:t>Presently, conversational agents</w:t>
+      </w:r>
+      <w:r>
+        <w:t xml:space="preserve"> </w:t>
+      </w:r>
+      <w:r>
+        <w:t>available for personal use and in commercial organizations are often disappointing thus leaving users</w:t>
+      </w:r>
+      <w:r>
+        <w:t xml:space="preserve"> </w:t>
+      </w:r>
+      <w:r>
+        <w:t>and customer exasperated due to unmet expectations.</w:t>
+      </w:r>
+    </w:p>
+    <w:p>
+      <w:r>
+        <w:rPr>
+          <w:noProof/>
+        </w:rPr>
+        <w:drawing>
+          <wp:inline distT="0" distB="0" distL="0" distR="0" wp14:anchorId="0F188F02" wp14:editId="09A13879">
+            <wp:extent cx="4142105" cy="2037420"/>
+            <wp:effectExtent l="0" t="0" r="0" b="0"/>
+            <wp:docPr id="302999557" name="Picture 1" descr="A screenshot of a computer and a monitor&#10;&#10;AI-generated content may be incorrect."/>
+            <wp:cNvGraphicFramePr>
+              <a:graphicFrameLocks xmlns:a="http://schemas.openxmlformats.org/drawingml/2006/main" noChangeAspect="1"/>
+            </wp:cNvGraphicFramePr>
+            <a:graphic xmlns:a="http://schemas.openxmlformats.org/drawingml/2006/main">
+              <a:graphicData uri="http://schemas.openxmlformats.org/drawingml/2006/picture">
+                <pic:pic xmlns:pic="http://schemas.openxmlformats.org/drawingml/2006/picture">
+                  <pic:nvPicPr>
+                    <pic:cNvPr id="302999557" name="Picture 1" descr="A screenshot of a computer and a monitor&#10;&#10;AI-generated content may be incorrect."/>
+                    <pic:cNvPicPr/>
+                  </pic:nvPicPr>
+                  <pic:blipFill>
+                    <a:blip r:embed="rId5" cstate="print">
+                      <a:extLst>
+                        <a:ext uri="{28A0092B-C50C-407E-A947-70E740481C1C}">
+                          <a14:useLocalDpi xmlns:a14="http://schemas.microsoft.com/office/drawing/2010/main" val="0"/>
+                        </a:ext>
+                      </a:extLst>
+                    </a:blip>
+                    <a:stretch>
+                      <a:fillRect/>
+                    </a:stretch>
+                  </pic:blipFill>
+                  <pic:spPr>
+                    <a:xfrm>
+                      <a:off x="0" y="0"/>
+                      <a:ext cx="4173541" cy="2052883"/>
+                    </a:xfrm>
+                    <a:prstGeom prst="rect">
+                      <a:avLst/>
+                    </a:prstGeom>
+                  </pic:spPr>
+                </pic:pic>
+              </a:graphicData>
+            </a:graphic>
+          </wp:inline>
+        </w:drawing>
+      </w:r>
+    </w:p>
+    <w:p>
+      <w:r>
+        <w:t>1. Mode of interaction (voice/speech or text-based interactions)</w:t>
+      </w:r>
+    </w:p>
+    <w:p>
+      <w:r>
+        <w:t>2. Task-oriented or non-task-oriented dialogue systems</w:t>
+      </w:r>
+    </w:p>
+    <w:p>
+      <w:r>
+        <w:t xml:space="preserve">3. Rule-based vs corpus-based vs Frame-based dialogue </w:t>
+      </w:r>
+      <w:r>
+        <w:t>s</w:t>
+      </w:r>
+      <w:r>
+        <w:t>ystems</w:t>
+      </w:r>
+    </w:p>
+    <w:p>
+      <w:r>
+        <w:t>4. Open-Domain or Domain-Specific dialogue systems</w:t>
+      </w:r>
+    </w:p>
+    <w:p/>
+    <w:p>
+      <w:r>
+        <w:rPr>
+          <w:noProof/>
+        </w:rPr>
+        <w:lastRenderedPageBreak/>
+        <w:drawing>
+          <wp:inline distT="0" distB="0" distL="0" distR="0" wp14:anchorId="43E8A7AC" wp14:editId="0FF6C99D">
+            <wp:extent cx="3808429" cy="1196238"/>
+            <wp:effectExtent l="0" t="0" r="1905" b="0"/>
+            <wp:docPr id="188626140" name="Picture 2" descr="A diagram of a chat bot&#10;&#10;AI-generated content may be incorrect."/>
+            <wp:cNvGraphicFramePr>
+              <a:graphicFrameLocks xmlns:a="http://schemas.openxmlformats.org/drawingml/2006/main" noChangeAspect="1"/>
+            </wp:cNvGraphicFramePr>
+            <a:graphic xmlns:a="http://schemas.openxmlformats.org/drawingml/2006/main">
+              <a:graphicData uri="http://schemas.openxmlformats.org/drawingml/2006/picture">
+                <pic:pic xmlns:pic="http://schemas.openxmlformats.org/drawingml/2006/picture">
+                  <pic:nvPicPr>
+                    <pic:cNvPr id="188626140" name="Picture 2" descr="A diagram of a chat bot&#10;&#10;AI-generated content may be incorrect."/>
+                    <pic:cNvPicPr/>
+                  </pic:nvPicPr>
+                  <pic:blipFill>
+                    <a:blip r:embed="rId6" cstate="print">
+                      <a:extLst>
+                        <a:ext uri="{28A0092B-C50C-407E-A947-70E740481C1C}">
+                          <a14:useLocalDpi xmlns:a14="http://schemas.microsoft.com/office/drawing/2010/main" val="0"/>
+                        </a:ext>
+                      </a:extLst>
+                    </a:blip>
+                    <a:stretch>
+                      <a:fillRect/>
+                    </a:stretch>
+                  </pic:blipFill>
+                  <pic:spPr>
+                    <a:xfrm>
+                      <a:off x="0" y="0"/>
+                      <a:ext cx="3851010" cy="1209613"/>
+                    </a:xfrm>
+                    <a:prstGeom prst="rect">
+                      <a:avLst/>
+                    </a:prstGeom>
+                  </pic:spPr>
+                </pic:pic>
+              </a:graphicData>
+            </a:graphic>
+          </wp:inline>
+        </w:drawing>
+      </w:r>
+    </w:p>
+    <w:p>
+      <w:r>
+        <w:t>Task-oriented chatbots</w:t>
+      </w:r>
+      <w:r>
+        <w:t>:</w:t>
+      </w:r>
+    </w:p>
+    <w:p>
+      <w:r>
+        <w:t>These agents are usually designed for a specific task and are often set up to accommodate</w:t>
+      </w:r>
+    </w:p>
+    <w:p>
+      <w:r>
+        <w:t>shorter conversations in a closed domain.</w:t>
+      </w:r>
+    </w:p>
+    <w:p/>
+    <w:p>
+      <w:r>
+        <w:t>Non-task-oriented chatbots</w:t>
+      </w:r>
+      <w:r>
+        <w:t>:</w:t>
+      </w:r>
+    </w:p>
+    <w:p>
+      <w:r>
+        <w:t xml:space="preserve">These chatbots </w:t>
+      </w:r>
+      <w:proofErr w:type="gramStart"/>
+      <w:r>
+        <w:t>are capable of simulating</w:t>
+      </w:r>
+      <w:proofErr w:type="gramEnd"/>
+      <w:r>
+        <w:t xml:space="preserve"> human interaction and tend to perform chitchat</w:t>
+      </w:r>
+    </w:p>
+    <w:p>
+      <w:r>
+        <w:t>especially for entertainment in open domains.</w:t>
+      </w:r>
+    </w:p>
+    <w:p/>
+    <w:p>
+      <w:pPr>
+        <w:rPr>
+          <w:b/>
+          <w:bCs/>
+          <w:u w:val="single"/>
+        </w:rPr>
+      </w:pPr>
+      <w:r>
+        <w:rPr>
+          <w:b/>
+          <w:bCs/>
+          <w:u w:val="single"/>
+        </w:rPr>
+        <w:t>CONVERSATION CHARACTERISTICS</w:t>
+      </w:r>
+    </w:p>
+    <w:p>
+      <w:r>
+        <w:t>Human agent = A</w:t>
+      </w:r>
+    </w:p>
+    <w:p>
+      <w:r>
+        <w:t>Human client = U</w:t>
+      </w:r>
+    </w:p>
+    <w:p>
+      <w:r>
+        <w:t>Turn = human needs multiple turns cause of pause in the middle of turns or overlaps in speech</w:t>
+      </w:r>
+    </w:p>
+    <w:p>
+      <w:r>
+        <w:t xml:space="preserve">Eg, </w:t>
+      </w:r>
+    </w:p>
+    <w:p>
+      <w:r>
+        <w:t>A1 = chatbot intro</w:t>
+      </w:r>
+    </w:p>
+    <w:p>
+      <w:r>
+        <w:t>U1 = my answer</w:t>
+      </w:r>
+    </w:p>
+    <w:p>
+      <w:r>
+        <w:t>A2,A2,A2 ... = multiple to-dos presented by agent/multiple lines (turns) in the same answer</w:t>
+      </w:r>
+    </w:p>
+    <w:p>
+      <w:r>
+        <w:t>U2</w:t>
+      </w:r>
+    </w:p>
+    <w:p>
+      <w:r>
+        <w:t>...</w:t>
+      </w:r>
+    </w:p>
+    <w:p/>
+    <w:p>
+      <w:r>
+        <w:t>Speech acts/Dialog acts = verbal actions performed by the speaker</w:t>
+      </w:r>
+    </w:p>
+    <w:p>
+      <w:pPr>
+        <w:pStyle w:val="ListParagraph"/>
+        <w:numPr>
+          <w:ilvl w:val="0"/>
+          <w:numId w:val="1"/>
+        </w:numPr>
+      </w:pPr>
+      <w:r>
+        <w:t>Greet, insult, compliment, plead, flirt, supply info., get work done</w:t>
+      </w:r>
+    </w:p>
+    <w:p>
+      <w:r>
+        <w:lastRenderedPageBreak/>
+        <w:t>TAXONOMY of 4 classes:</w:t>
+      </w:r>
+    </w:p>
+    <w:p>
+      <w:pPr>
+        <w:pStyle w:val="ListParagraph"/>
+        <w:numPr>
+          <w:ilvl w:val="0"/>
+          <w:numId w:val="2"/>
+        </w:numPr>
+      </w:pPr>
+      <w:r>
+        <w:t>CONSTATIVES</w:t>
+      </w:r>
+    </w:p>
+    <w:p>
+      <w:pPr>
+        <w:pStyle w:val="ListParagraph"/>
+      </w:pPr>
+      <w:r>
+        <w:t>Committing the speaker to something’s being the case</w:t>
+      </w:r>
+      <w:r>
+        <w:t>:</w:t>
+      </w:r>
+    </w:p>
+    <w:p>
+      <w:pPr>
+        <w:pStyle w:val="ListParagraph"/>
+        <w:numPr>
+          <w:ilvl w:val="0"/>
+          <w:numId w:val="1"/>
+        </w:numPr>
+      </w:pPr>
+      <w:r>
+        <w:t>A</w:t>
+      </w:r>
+      <w:r>
+        <w:t>nswering</w:t>
+      </w:r>
+    </w:p>
+    <w:p>
+      <w:pPr>
+        <w:pStyle w:val="ListParagraph"/>
+        <w:numPr>
+          <w:ilvl w:val="0"/>
+          <w:numId w:val="1"/>
+        </w:numPr>
+      </w:pPr>
+      <w:r>
+        <w:t>C</w:t>
+      </w:r>
+      <w:r>
+        <w:t>laiming</w:t>
+      </w:r>
+    </w:p>
+    <w:p>
+      <w:pPr>
+        <w:pStyle w:val="ListParagraph"/>
+        <w:numPr>
+          <w:ilvl w:val="0"/>
+          <w:numId w:val="1"/>
+        </w:numPr>
+      </w:pPr>
+      <w:r>
+        <w:t>C</w:t>
+      </w:r>
+      <w:r>
+        <w:t>onfirming</w:t>
+      </w:r>
+    </w:p>
+    <w:p>
+      <w:pPr>
+        <w:pStyle w:val="ListParagraph"/>
+        <w:numPr>
+          <w:ilvl w:val="0"/>
+          <w:numId w:val="1"/>
+        </w:numPr>
+      </w:pPr>
+      <w:r>
+        <w:t>D</w:t>
+      </w:r>
+      <w:r>
+        <w:t>enying</w:t>
+      </w:r>
+    </w:p>
+    <w:p>
+      <w:pPr>
+        <w:pStyle w:val="ListParagraph"/>
+        <w:numPr>
+          <w:ilvl w:val="0"/>
+          <w:numId w:val="1"/>
+        </w:numPr>
+      </w:pPr>
+      <w:r>
+        <w:t>D</w:t>
+      </w:r>
+      <w:r>
+        <w:t>isagreeing</w:t>
+      </w:r>
+    </w:p>
+    <w:p>
+      <w:pPr>
+        <w:pStyle w:val="ListParagraph"/>
+        <w:numPr>
+          <w:ilvl w:val="0"/>
+          <w:numId w:val="1"/>
+        </w:numPr>
+      </w:pPr>
+      <w:r>
+        <w:t>S</w:t>
+      </w:r>
+      <w:r>
+        <w:t>tating</w:t>
+      </w:r>
+    </w:p>
+    <w:p>
+      <w:pPr>
+        <w:pStyle w:val="ListParagraph"/>
+      </w:pPr>
+    </w:p>
+    <w:p>
+      <w:pPr>
+        <w:pStyle w:val="ListParagraph"/>
+        <w:numPr>
+          <w:ilvl w:val="0"/>
+          <w:numId w:val="2"/>
+        </w:numPr>
+      </w:pPr>
+      <w:r>
+        <w:t>DIRECTIVES</w:t>
+      </w:r>
+    </w:p>
+    <w:p>
+      <w:pPr>
+        <w:pStyle w:val="ListParagraph"/>
+      </w:pPr>
+      <w:r>
+        <w:t>Attempts by the speaker to get the addressee to do something</w:t>
+      </w:r>
+      <w:r>
+        <w:t>:</w:t>
+      </w:r>
+    </w:p>
+    <w:p>
+      <w:pPr>
+        <w:pStyle w:val="ListParagraph"/>
+        <w:numPr>
+          <w:ilvl w:val="0"/>
+          <w:numId w:val="1"/>
+        </w:numPr>
+      </w:pPr>
+      <w:r>
+        <w:t>A</w:t>
+      </w:r>
+      <w:r>
+        <w:t>dvising</w:t>
+      </w:r>
+    </w:p>
+    <w:p>
+      <w:pPr>
+        <w:pStyle w:val="ListParagraph"/>
+        <w:numPr>
+          <w:ilvl w:val="0"/>
+          <w:numId w:val="1"/>
+        </w:numPr>
+      </w:pPr>
+      <w:r>
+        <w:t>A</w:t>
+      </w:r>
+      <w:r>
+        <w:t>sking</w:t>
+      </w:r>
+    </w:p>
+    <w:p>
+      <w:pPr>
+        <w:pStyle w:val="ListParagraph"/>
+        <w:numPr>
+          <w:ilvl w:val="0"/>
+          <w:numId w:val="1"/>
+        </w:numPr>
+      </w:pPr>
+      <w:r>
+        <w:t>F</w:t>
+      </w:r>
+      <w:r>
+        <w:t>orbidding</w:t>
+      </w:r>
+    </w:p>
+    <w:p>
+      <w:pPr>
+        <w:pStyle w:val="ListParagraph"/>
+        <w:numPr>
+          <w:ilvl w:val="0"/>
+          <w:numId w:val="1"/>
+        </w:numPr>
+      </w:pPr>
+      <w:r>
+        <w:t>I</w:t>
+      </w:r>
+      <w:r>
+        <w:t>nviting</w:t>
+      </w:r>
+    </w:p>
+    <w:p>
+      <w:pPr>
+        <w:pStyle w:val="ListParagraph"/>
+        <w:numPr>
+          <w:ilvl w:val="0"/>
+          <w:numId w:val="1"/>
+        </w:numPr>
+      </w:pPr>
+      <w:r>
+        <w:t>O</w:t>
+      </w:r>
+      <w:r>
+        <w:t>rdering</w:t>
+      </w:r>
+    </w:p>
+    <w:p>
+      <w:pPr>
+        <w:pStyle w:val="ListParagraph"/>
+        <w:numPr>
+          <w:ilvl w:val="0"/>
+          <w:numId w:val="1"/>
+        </w:numPr>
+      </w:pPr>
+      <w:r>
+        <w:t>R</w:t>
+      </w:r>
+      <w:r>
+        <w:t>equesting</w:t>
+      </w:r>
+    </w:p>
+    <w:p>
+      <w:pPr>
+        <w:pStyle w:val="ListParagraph"/>
+      </w:pPr>
+    </w:p>
+    <w:p>
+      <w:pPr>
+        <w:pStyle w:val="ListParagraph"/>
+        <w:numPr>
+          <w:ilvl w:val="0"/>
+          <w:numId w:val="2"/>
+        </w:numPr>
+      </w:pPr>
+      <w:r>
+        <w:t>COMMISSIVES</w:t>
+      </w:r>
+    </w:p>
+    <w:p>
+      <w:pPr>
+        <w:pStyle w:val="ListParagraph"/>
+      </w:pPr>
+      <w:r>
+        <w:t>Committing the speaker to some future course of action</w:t>
+      </w:r>
+      <w:r>
+        <w:t>:</w:t>
+      </w:r>
+    </w:p>
+    <w:p>
+      <w:pPr>
+        <w:pStyle w:val="ListParagraph"/>
+        <w:numPr>
+          <w:ilvl w:val="0"/>
+          <w:numId w:val="1"/>
+        </w:numPr>
+      </w:pPr>
+      <w:r>
+        <w:t>P</w:t>
+      </w:r>
+      <w:r>
+        <w:t>romising</w:t>
+      </w:r>
+    </w:p>
+    <w:p>
+      <w:pPr>
+        <w:pStyle w:val="ListParagraph"/>
+        <w:numPr>
+          <w:ilvl w:val="0"/>
+          <w:numId w:val="1"/>
+        </w:numPr>
+      </w:pPr>
+      <w:r>
+        <w:t>P</w:t>
+      </w:r>
+      <w:r>
+        <w:t>lanning</w:t>
+      </w:r>
+    </w:p>
+    <w:p>
+      <w:pPr>
+        <w:pStyle w:val="ListParagraph"/>
+        <w:numPr>
+          <w:ilvl w:val="0"/>
+          <w:numId w:val="1"/>
+        </w:numPr>
+      </w:pPr>
+      <w:r>
+        <w:t>V</w:t>
+      </w:r>
+      <w:r>
+        <w:t>owing</w:t>
+      </w:r>
+    </w:p>
+    <w:p>
+      <w:pPr>
+        <w:pStyle w:val="ListParagraph"/>
+        <w:numPr>
+          <w:ilvl w:val="0"/>
+          <w:numId w:val="1"/>
+        </w:numPr>
+      </w:pPr>
+      <w:r>
+        <w:t>B</w:t>
+      </w:r>
+      <w:r>
+        <w:t>etting</w:t>
+      </w:r>
+    </w:p>
+    <w:p>
+      <w:pPr>
+        <w:pStyle w:val="ListParagraph"/>
+        <w:numPr>
+          <w:ilvl w:val="0"/>
+          <w:numId w:val="1"/>
+        </w:numPr>
+      </w:pPr>
+      <w:r>
+        <w:t>O</w:t>
+      </w:r>
+      <w:r>
+        <w:t>pposing</w:t>
+      </w:r>
+    </w:p>
+    <w:p>
+      <w:pPr>
+        <w:pStyle w:val="ListParagraph"/>
+      </w:pPr>
+    </w:p>
+    <w:p>
+      <w:pPr>
+        <w:pStyle w:val="ListParagraph"/>
+        <w:numPr>
+          <w:ilvl w:val="0"/>
+          <w:numId w:val="2"/>
+        </w:numPr>
+      </w:pPr>
+      <w:r>
+        <w:t xml:space="preserve">ACKNOWLEDGEMENTS </w:t>
+      </w:r>
+    </w:p>
+    <w:p>
+      <w:pPr>
+        <w:pStyle w:val="ListParagraph"/>
+      </w:pPr>
+      <w:r>
+        <w:t>Express the speaker’s attitude regarding the hearer with respect to some social action</w:t>
+      </w:r>
+      <w:r>
+        <w:t>:</w:t>
+      </w:r>
+    </w:p>
+    <w:p>
+      <w:pPr>
+        <w:pStyle w:val="ListParagraph"/>
+        <w:numPr>
+          <w:ilvl w:val="0"/>
+          <w:numId w:val="1"/>
+        </w:numPr>
+      </w:pPr>
+      <w:r>
+        <w:t>A</w:t>
+      </w:r>
+      <w:r>
+        <w:t>pologizing</w:t>
+      </w:r>
+    </w:p>
+    <w:p>
+      <w:pPr>
+        <w:pStyle w:val="ListParagraph"/>
+        <w:numPr>
+          <w:ilvl w:val="0"/>
+          <w:numId w:val="1"/>
+        </w:numPr>
+      </w:pPr>
+      <w:r>
+        <w:t>G</w:t>
+      </w:r>
+      <w:r>
+        <w:t>reeting</w:t>
+      </w:r>
+    </w:p>
+    <w:p>
+      <w:pPr>
+        <w:pStyle w:val="ListParagraph"/>
+        <w:numPr>
+          <w:ilvl w:val="0"/>
+          <w:numId w:val="1"/>
+        </w:numPr>
+      </w:pPr>
+      <w:r>
+        <w:t>T</w:t>
+      </w:r>
+      <w:r>
+        <w:t>hanking</w:t>
+      </w:r>
+    </w:p>
+    <w:p>
+      <w:pPr>
+        <w:pStyle w:val="ListParagraph"/>
+        <w:numPr>
+          <w:ilvl w:val="0"/>
+          <w:numId w:val="1"/>
+        </w:numPr>
+      </w:pPr>
+      <w:r>
+        <w:t>accepting an acknowledgment</w:t>
+      </w:r>
+    </w:p>
+    <w:p>
+      <w:pPr>
+        <w:ind w:left="360"/>
+      </w:pPr>
+    </w:p>
+    <w:p>
+      <w:pPr>
+        <w:ind w:left="360"/>
+      </w:pPr>
+    </w:p>
+    <w:p>
+      <w:pPr>
+        <w:ind w:left="360"/>
+      </w:pPr>
+      <w:r>
+        <w:lastRenderedPageBreak/>
+        <w:t xml:space="preserve">Example, </w:t>
+      </w:r>
+    </w:p>
+    <w:p>
+      <w:pPr>
+        <w:ind w:left="360"/>
+      </w:pPr>
+      <w:r>
+        <w:t>Turn off light = directive</w:t>
+      </w:r>
+    </w:p>
+    <w:p>
+      <w:pPr>
+        <w:ind w:left="360"/>
+      </w:pPr>
+      <w:r>
+        <w:t>May I buy a ticket = constative</w:t>
+      </w:r>
+    </w:p>
+    <w:p>
+      <w:pPr>
+        <w:ind w:left="360"/>
+      </w:pPr>
+      <w:r>
+        <w:t>Bye and thanks = acknowledgement</w:t>
+      </w:r>
+    </w:p>
+    <w:p>
+      <w:pPr>
+        <w:ind w:left="360"/>
+      </w:pPr>
+    </w:p>
+    <w:p>
+      <w:pPr>
+        <w:ind w:left="360"/>
+        <w:rPr>
+          <w:u w:val="single"/>
+        </w:rPr>
+      </w:pPr>
+      <w:r>
+        <w:rPr>
+          <w:u w:val="single"/>
+        </w:rPr>
+        <w:t>Common grounding = mutual knowledge and acknowledgement</w:t>
+      </w:r>
+    </w:p>
+    <w:p>
+      <w:pPr>
+        <w:ind w:left="360"/>
+        <w:rPr>
+          <w:u w:val="single"/>
+        </w:rPr>
+      </w:pPr>
+    </w:p>
+    <w:p>
+      <w:pPr>
+        <w:ind w:left="360"/>
+        <w:rPr>
+          <w:b/>
+          <w:bCs/>
+          <w:u w:val="single"/>
+        </w:rPr>
+      </w:pPr>
+      <w:r>
+        <w:rPr>
+          <w:b/>
+          <w:bCs/>
+          <w:u w:val="single"/>
+        </w:rPr>
+        <w:t>CORPUS BASED CHATBOTS</w:t>
+      </w:r>
+    </w:p>
+    <w:p>
+      <w:pPr>
+        <w:ind w:left="360"/>
+      </w:pPr>
+      <w:r>
+        <w:t>Topical-Chat is a human-human conversation dataset, covering 8 broad topics.</w:t>
+      </w:r>
+    </w:p>
+    <w:p>
+      <w:pPr>
+        <w:ind w:left="360"/>
+      </w:pPr>
+      <w:r>
+        <w:t xml:space="preserve">Dialogue systems = pre-trained using large datasets of conversations </w:t>
+      </w:r>
+    </w:p>
+    <w:p>
+      <w:pPr>
+        <w:ind w:left="360"/>
+      </w:pPr>
+    </w:p>
+    <w:p>
+      <w:pPr>
+        <w:ind w:left="360"/>
+      </w:pPr>
+      <w:r>
+        <w:t xml:space="preserve">Corpus based chatbots = </w:t>
+      </w:r>
+      <w:r>
+        <w:t>generate a single response turn that given the context.</w:t>
+      </w:r>
+    </w:p>
+    <w:p>
+      <w:pPr>
+        <w:ind w:left="360"/>
+        <w:rPr>
+          <w:u w:val="single"/>
+        </w:rPr>
+      </w:pPr>
+      <w:r>
+        <w:rPr>
+          <w:u w:val="single"/>
+        </w:rPr>
+        <w:t>RETRIEVAL METHODS</w:t>
+      </w:r>
+      <w:r>
+        <w:rPr>
+          <w:u w:val="single"/>
+        </w:rPr>
+        <w:t>:</w:t>
+      </w:r>
+    </w:p>
+    <w:p>
+      <w:pPr>
+        <w:ind w:left="360"/>
+      </w:pPr>
+      <w:r>
+        <w:t>Use information retrieval techniques to find appropriate response</w:t>
+      </w:r>
+    </w:p>
+    <w:p>
+      <w:pPr>
+        <w:ind w:left="360"/>
+      </w:pPr>
+    </w:p>
+    <w:p>
+      <w:pPr>
+        <w:ind w:left="360"/>
+        <w:rPr>
+          <w:u w:val="single"/>
+        </w:rPr>
+      </w:pPr>
+      <w:r>
+        <w:rPr>
+          <w:u w:val="single"/>
+        </w:rPr>
+        <w:t>GENERATION METHODS</w:t>
+      </w:r>
+      <w:r>
+        <w:rPr>
+          <w:u w:val="single"/>
+        </w:rPr>
+        <w:t>:</w:t>
+      </w:r>
+    </w:p>
+    <w:p>
+      <w:pPr>
+        <w:ind w:left="360"/>
+      </w:pPr>
+      <w:r>
+        <w:t xml:space="preserve">Use a language model or encoder-decoder to generate </w:t>
+      </w:r>
+    </w:p>
+    <w:p>
+      <w:pPr>
+        <w:ind w:left="360"/>
+      </w:pPr>
+    </w:p>
+    <w:p>
+      <w:pPr>
+        <w:ind w:left="360"/>
+        <w:rPr>
+          <w:u w:val="single"/>
+        </w:rPr>
+      </w:pPr>
+      <w:r>
+        <w:rPr>
+          <w:u w:val="single"/>
+        </w:rPr>
+        <w:t>RESPONSE BY RETRIEVAL:</w:t>
+      </w:r>
+    </w:p>
+    <w:p>
+      <w:pPr>
+        <w:ind w:left="360"/>
+      </w:pPr>
+      <w:r>
+        <w:t xml:space="preserve">Takes query q </w:t>
+      </w:r>
+    </w:p>
+    <w:p>
+      <w:pPr>
+        <w:ind w:left="360"/>
+      </w:pPr>
+      <w:r>
+        <w:t>Retrieves one or more appropriate turns from corpus of conversations C (training dataset of turns)</w:t>
+      </w:r>
+    </w:p>
+    <w:p>
+      <w:pPr>
+        <w:ind w:left="360"/>
+      </w:pPr>
+      <w:r>
+        <w:t>Rely on similarity metric to rank potential responses (turns) to user’s query q</w:t>
+      </w:r>
+    </w:p>
+    <w:p>
+      <w:pPr>
+        <w:ind w:left="360"/>
+      </w:pPr>
+      <w:r>
+        <w:t xml:space="preserve">Return the turn with the highest scoring </w:t>
+      </w:r>
+    </w:p>
+    <w:p>
+      <w:pPr>
+        <w:ind w:left="360"/>
+      </w:pPr>
+      <w:r>
+        <w:t>Classic info retrieval with TF-IDF for Neural Information Retrieval using bi-encoders</w:t>
+      </w:r>
+    </w:p>
+    <w:p>
+      <w:pPr>
+        <w:ind w:left="360"/>
+        <w:rPr>
+          <w:b/>
+          <w:bCs/>
+        </w:rPr>
+      </w:pPr>
+      <w:r>
+        <w:rPr>
+          <w:b/>
+          <w:bCs/>
+        </w:rPr>
+        <w:t xml:space="preserve">Cos(theta) = </w:t>
+      </w:r>
+      <w:proofErr w:type="spellStart"/>
+      <w:r>
+        <w:rPr>
+          <w:b/>
+          <w:bCs/>
+        </w:rPr>
+        <w:t>a.b</w:t>
+      </w:r>
+      <w:proofErr w:type="spellEnd"/>
+      <w:r>
+        <w:rPr>
+          <w:b/>
+          <w:bCs/>
+        </w:rPr>
+        <w:t>/|a||b|</w:t>
+      </w:r>
+    </w:p>
+    <w:p>
+      <w:pPr>
+        <w:ind w:left="360"/>
+      </w:pPr>
+      <w:r>
+        <w:rPr>
+          <w:noProof/>
+        </w:rPr>
+        <w:lastRenderedPageBreak/>
+        <w:drawing>
+          <wp:inline distT="0" distB="0" distL="0" distR="0" wp14:anchorId="753CE146" wp14:editId="496885C4">
+            <wp:extent cx="1894787" cy="355273"/>
+            <wp:effectExtent l="0" t="0" r="0" b="635"/>
+            <wp:docPr id="1883589508" name="Picture 3" descr="A black symbol with a white background&#10;&#10;AI-generated content may be incorrect."/>
+            <wp:cNvGraphicFramePr>
+              <a:graphicFrameLocks xmlns:a="http://schemas.openxmlformats.org/drawingml/2006/main" noChangeAspect="1"/>
+            </wp:cNvGraphicFramePr>
+            <a:graphic xmlns:a="http://schemas.openxmlformats.org/drawingml/2006/main">
+              <a:graphicData uri="http://schemas.openxmlformats.org/drawingml/2006/picture">
+                <pic:pic xmlns:pic="http://schemas.openxmlformats.org/drawingml/2006/picture">
+                  <pic:nvPicPr>
+                    <pic:cNvPr id="1883589508" name="Picture 3" descr="A black symbol with a white background&#10;&#10;AI-generated content may be incorrect."/>
+                    <pic:cNvPicPr/>
+                  </pic:nvPicPr>
+                  <pic:blipFill>
+                    <a:blip r:embed="rId7" cstate="print">
+                      <a:extLst>
+                        <a:ext uri="{28A0092B-C50C-407E-A947-70E740481C1C}">
+                          <a14:useLocalDpi xmlns:a14="http://schemas.microsoft.com/office/drawing/2010/main" val="0"/>
+                        </a:ext>
+                      </a:extLst>
+                    </a:blip>
+                    <a:stretch>
+                      <a:fillRect/>
+                    </a:stretch>
+                  </pic:blipFill>
+                  <pic:spPr>
+                    <a:xfrm>
+                      <a:off x="0" y="0"/>
+                      <a:ext cx="1966977" cy="368809"/>
+                    </a:xfrm>
+                    <a:prstGeom prst="rect">
+                      <a:avLst/>
+                    </a:prstGeom>
+                  </pic:spPr>
+                </pic:pic>
+              </a:graphicData>
+            </a:graphic>
+          </wp:inline>
+        </w:drawing>
+      </w:r>
+    </w:p>
+    <w:p>
+      <w:pPr>
+        <w:ind w:left="360"/>
+      </w:pPr>
+      <w:r>
+        <w:t>Response means choosing r that returns highest TF-IDF cosine with q</w:t>
+      </w:r>
+    </w:p>
+    <w:p/>
+    <w:p>
+      <w:r>
+        <w:t xml:space="preserve">PROBLEM = </w:t>
+      </w:r>
+    </w:p>
+    <w:p>
+      <w:pPr>
+        <w:pStyle w:val="ListParagraph"/>
+        <w:numPr>
+          <w:ilvl w:val="0"/>
+          <w:numId w:val="3"/>
+        </w:numPr>
+      </w:pPr>
+      <w:r>
+        <w:t xml:space="preserve">Vocabulary mismatch problem </w:t>
+      </w:r>
+    </w:p>
+    <w:p>
+      <w:pPr>
+        <w:pStyle w:val="ListParagraph"/>
+        <w:numPr>
+          <w:ilvl w:val="0"/>
+          <w:numId w:val="3"/>
+        </w:numPr>
+      </w:pPr>
+      <w:r>
+        <w:t>Method works only if “exact” overlap b/w query q and document</w:t>
+      </w:r>
+    </w:p>
+    <w:p/>
+    <w:p>
+      <w:r>
+        <w:t>SOLUTION =</w:t>
+      </w:r>
+    </w:p>
+    <w:p>
+      <w:pPr>
+        <w:pStyle w:val="ListParagraph"/>
+        <w:numPr>
+          <w:ilvl w:val="0"/>
+          <w:numId w:val="3"/>
+        </w:numPr>
+      </w:pPr>
+      <w:r>
+        <w:t>Handle synonyms with:</w:t>
+      </w:r>
+    </w:p>
+    <w:p>
+      <w:pPr>
+        <w:pStyle w:val="ListParagraph"/>
+        <w:numPr>
+          <w:ilvl w:val="1"/>
+          <w:numId w:val="3"/>
+        </w:numPr>
+      </w:pPr>
+      <w:r>
+        <w:t>dense vectors (word embeddings)</w:t>
+      </w:r>
+    </w:p>
+    <w:p>
+      <w:pPr>
+        <w:pStyle w:val="ListParagraph"/>
+        <w:numPr>
+          <w:ilvl w:val="1"/>
+          <w:numId w:val="3"/>
+        </w:numPr>
+      </w:pPr>
+      <w:r>
+        <w:t xml:space="preserve">encoders (BERT, Transformers </w:t>
+      </w:r>
+      <w:proofErr w:type="spellStart"/>
+      <w:r>
+        <w:t>etc</w:t>
+      </w:r>
+      <w:proofErr w:type="spellEnd"/>
+      <w:r>
+        <w:t>)</w:t>
+      </w:r>
+    </w:p>
+    <w:p>
+      <w:r>
+        <w:rPr>
+          <w:noProof/>
+        </w:rPr>
+        <w:drawing>
+          <wp:inline distT="0" distB="0" distL="0" distR="0" wp14:anchorId="5FDC8DBC" wp14:editId="2D097BE7">
+            <wp:extent cx="3704734" cy="1926461"/>
+            <wp:effectExtent l="0" t="0" r="3810" b="4445"/>
+            <wp:docPr id="677136707" name="Picture 4" descr="A diagram of a algorithm&#10;&#10;AI-generated content may be incorrect."/>
+            <wp:cNvGraphicFramePr>
+              <a:graphicFrameLocks xmlns:a="http://schemas.openxmlformats.org/drawingml/2006/main" noChangeAspect="1"/>
+            </wp:cNvGraphicFramePr>
+            <a:graphic xmlns:a="http://schemas.openxmlformats.org/drawingml/2006/main">
+              <a:graphicData uri="http://schemas.openxmlformats.org/drawingml/2006/picture">
+                <pic:pic xmlns:pic="http://schemas.openxmlformats.org/drawingml/2006/picture">
+                  <pic:nvPicPr>
+                    <pic:cNvPr id="677136707" name="Picture 4" descr="A diagram of a algorithm&#10;&#10;AI-generated content may be incorrect."/>
+                    <pic:cNvPicPr/>
+                  </pic:nvPicPr>
+                  <pic:blipFill>
+                    <a:blip r:embed="rId8">
+                      <a:extLst>
+                        <a:ext uri="{28A0092B-C50C-407E-A947-70E740481C1C}">
+                          <a14:useLocalDpi xmlns:a14="http://schemas.microsoft.com/office/drawing/2010/main" val="0"/>
+                        </a:ext>
+                      </a:extLst>
+                    </a:blip>
+                    <a:stretch>
+                      <a:fillRect/>
+                    </a:stretch>
+                  </pic:blipFill>
+                  <pic:spPr>
+                    <a:xfrm>
+                      <a:off x="0" y="0"/>
+                      <a:ext cx="3745158" cy="1947482"/>
+                    </a:xfrm>
+                    <a:prstGeom prst="rect">
+                      <a:avLst/>
+                    </a:prstGeom>
+                  </pic:spPr>
+                </pic:pic>
+              </a:graphicData>
+            </a:graphic>
+          </wp:inline>
+        </w:drawing>
+      </w:r>
+    </w:p>
+    <w:p>
+      <w:proofErr w:type="spellStart"/>
+      <w:r>
+        <w:t>BERT_q</w:t>
+      </w:r>
+      <w:proofErr w:type="spellEnd"/>
+      <w:r>
+        <w:t xml:space="preserve"> encodes user query</w:t>
+      </w:r>
+    </w:p>
+    <w:p>
+      <w:proofErr w:type="spellStart"/>
+      <w:r>
+        <w:t>BERT_r</w:t>
+      </w:r>
+      <w:proofErr w:type="spellEnd"/>
+      <w:r>
+        <w:t xml:space="preserve"> encodes candidate response</w:t>
+      </w:r>
+    </w:p>
+    <w:p>
+      <w:r>
+        <w:t>We also represent the query and candidate</w:t>
+      </w:r>
+      <w:r>
+        <w:t xml:space="preserve"> </w:t>
+      </w:r>
+      <w:r>
+        <w:t>response as the [CLS] token (classification) of the respective encoders.</w:t>
+      </w:r>
+    </w:p>
+    <w:p>
+      <w:r>
+        <w:rPr>
+          <w:noProof/>
+        </w:rPr>
+        <w:drawing>
+          <wp:inline distT="0" distB="0" distL="0" distR="0" wp14:anchorId="1C2E08D0" wp14:editId="5746BB3D">
+            <wp:extent cx="3459142" cy="1187778"/>
+            <wp:effectExtent l="0" t="0" r="0" b="6350"/>
+            <wp:docPr id="489293768" name="Picture 5" descr="A math equations and formulas&#10;&#10;AI-generated content may be incorrect."/>
+            <wp:cNvGraphicFramePr>
+              <a:graphicFrameLocks xmlns:a="http://schemas.openxmlformats.org/drawingml/2006/main" noChangeAspect="1"/>
+            </wp:cNvGraphicFramePr>
+            <a:graphic xmlns:a="http://schemas.openxmlformats.org/drawingml/2006/main">
+              <a:graphicData uri="http://schemas.openxmlformats.org/drawingml/2006/picture">
+                <pic:pic xmlns:pic="http://schemas.openxmlformats.org/drawingml/2006/picture">
+                  <pic:nvPicPr>
+                    <pic:cNvPr id="489293768" name="Picture 5" descr="A math equations and formulas&#10;&#10;AI-generated content may be incorrect."/>
+                    <pic:cNvPicPr/>
+                  </pic:nvPicPr>
+                  <pic:blipFill>
+                    <a:blip r:embed="rId9">
+                      <a:extLst>
+                        <a:ext uri="{28A0092B-C50C-407E-A947-70E740481C1C}">
+                          <a14:useLocalDpi xmlns:a14="http://schemas.microsoft.com/office/drawing/2010/main" val="0"/>
+                        </a:ext>
+                      </a:extLst>
+                    </a:blip>
+                    <a:stretch>
+                      <a:fillRect/>
+                    </a:stretch>
+                  </pic:blipFill>
+                  <pic:spPr>
+                    <a:xfrm>
+                      <a:off x="0" y="0"/>
+                      <a:ext cx="3624596" cy="1244591"/>
+                    </a:xfrm>
+                    <a:prstGeom prst="rect">
+                      <a:avLst/>
+                    </a:prstGeom>
+                  </pic:spPr>
+                </pic:pic>
+              </a:graphicData>
+            </a:graphic>
+          </wp:inline>
+        </w:drawing>
+      </w:r>
+    </w:p>
+    <w:p>
+      <w:r>
+        <w:t>Extended to LONGER CONTEXT for query and user’s last turn with all turns in the convo</w:t>
+      </w:r>
+    </w:p>
+    <w:p>
+      <w:pPr>
+        <w:rPr>
+          <w:u w:val="single"/>
+        </w:rPr>
+      </w:pPr>
+      <w:r>
+        <w:rPr>
+          <w:u w:val="single"/>
+        </w:rPr>
+        <w:lastRenderedPageBreak/>
+        <w:t>RESPONSE BY GENERATION:</w:t>
+      </w:r>
+    </w:p>
+    <w:p>
+      <w:r>
+        <w:t xml:space="preserve">Transduces from user’s prior turn to system’s turn </w:t>
+      </w:r>
+    </w:p>
+    <w:p>
+      <w:r>
+        <w:t xml:space="preserve">Generate token </w:t>
+      </w:r>
+      <w:proofErr w:type="spellStart"/>
+      <w:r>
+        <w:t>r_t</w:t>
+      </w:r>
+      <w:proofErr w:type="spellEnd"/>
+      <w:r>
+        <w:t xml:space="preserve"> based on encoding of query q and entire history of conversation response: r1, ..., r_t-1</w:t>
+      </w:r>
+    </w:p>
+    <w:p>
+      <w:r>
+        <w:rPr>
+          <w:noProof/>
+        </w:rPr>
+        <w:drawing>
+          <wp:inline distT="0" distB="0" distL="0" distR="0" wp14:anchorId="475378FF" wp14:editId="5AF3BD64">
+            <wp:extent cx="3008015" cy="1864262"/>
+            <wp:effectExtent l="0" t="0" r="1905" b="3175"/>
+            <wp:docPr id="1395127005" name="Picture 6" descr="A diagram of a coder&#10;&#10;AI-generated content may be incorrect."/>
+            <wp:cNvGraphicFramePr>
+              <a:graphicFrameLocks xmlns:a="http://schemas.openxmlformats.org/drawingml/2006/main" noChangeAspect="1"/>
+            </wp:cNvGraphicFramePr>
+            <a:graphic xmlns:a="http://schemas.openxmlformats.org/drawingml/2006/main">
+              <a:graphicData uri="http://schemas.openxmlformats.org/drawingml/2006/picture">
+                <pic:pic xmlns:pic="http://schemas.openxmlformats.org/drawingml/2006/picture">
+                  <pic:nvPicPr>
+                    <pic:cNvPr id="1395127005" name="Picture 6" descr="A diagram of a coder&#10;&#10;AI-generated content may be incorrect."/>
+                    <pic:cNvPicPr/>
+                  </pic:nvPicPr>
+                  <pic:blipFill>
+                    <a:blip r:embed="rId10" cstate="print">
+                      <a:extLst>
+                        <a:ext uri="{28A0092B-C50C-407E-A947-70E740481C1C}">
+                          <a14:useLocalDpi xmlns:a14="http://schemas.microsoft.com/office/drawing/2010/main" val="0"/>
+                        </a:ext>
+                      </a:extLst>
+                    </a:blip>
+                    <a:stretch>
+                      <a:fillRect/>
+                    </a:stretch>
+                  </pic:blipFill>
+                  <pic:spPr>
+                    <a:xfrm>
+                      <a:off x="0" y="0"/>
+                      <a:ext cx="3085155" cy="1912071"/>
+                    </a:xfrm>
+                    <a:prstGeom prst="rect">
+                      <a:avLst/>
+                    </a:prstGeom>
+                  </pic:spPr>
+                </pic:pic>
+              </a:graphicData>
+            </a:graphic>
+          </wp:inline>
+        </w:drawing>
+      </w:r>
+    </w:p>
+    <w:p/>
+    <w:p>
+      <w:r>
+        <w:t xml:space="preserve">PROBLEM = </w:t>
+      </w:r>
+    </w:p>
+    <w:p>
+      <w:r>
+        <w:t xml:space="preserve">Generate predictable and repetitive responses </w:t>
+      </w:r>
+    </w:p>
+    <w:p>
+      <w:r>
+        <w:t xml:space="preserve">Produces turns that are too short </w:t>
+      </w:r>
+    </w:p>
+    <w:p>
+      <w:r>
+        <w:t xml:space="preserve">Performance decreases as input sequence becomes longer </w:t>
+      </w:r>
+    </w:p>
+    <w:p>
+      <w:r>
+        <w:t>A</w:t>
+      </w:r>
+      <w:r>
+        <w:t xml:space="preserve"> wide range of appropriate responses are possible for a given user’ query in</w:t>
+      </w:r>
+      <w:r>
+        <w:t xml:space="preserve"> </w:t>
+      </w:r>
+      <w:r>
+        <w:t xml:space="preserve">dialogue systems whereas machine translation systems consider </w:t>
+      </w:r>
+      <w:r>
+        <w:rPr>
+          <w:u w:val="single"/>
+        </w:rPr>
+        <w:t>phrase alignment</w:t>
+      </w:r>
+      <w:r>
+        <w:t xml:space="preserve"> between the</w:t>
+      </w:r>
+      <w:r>
+        <w:t xml:space="preserve"> </w:t>
+      </w:r>
+      <w:r>
+        <w:t xml:space="preserve">source and target sequences and thus they </w:t>
+      </w:r>
+      <w:r>
+        <w:rPr>
+          <w:u w:val="single"/>
+        </w:rPr>
+        <w:t>reduce the space of possible generated responses</w:t>
+      </w:r>
+      <w:r>
+        <w:t>.</w:t>
+      </w:r>
+    </w:p>
+    <w:p/>
+    <w:p>
+      <w:r>
+        <w:t xml:space="preserve">SOLUTION = </w:t>
+      </w:r>
+    </w:p>
+    <w:p>
+      <w:r>
+        <w:t xml:space="preserve">To avoid predictive and repetitive responses : replace greed search for response generation with </w:t>
+      </w:r>
+      <w:r>
+        <w:rPr>
+          <w:u w:val="single"/>
+        </w:rPr>
+        <w:t>diversity-enhanced versions of beam search</w:t>
+      </w:r>
+      <w:r>
+        <w:t xml:space="preserve"> or diversity-focused training objective </w:t>
+      </w:r>
+    </w:p>
+    <w:p>
+      <w:r>
+        <w:t xml:space="preserve">To improve performance on longer </w:t>
+      </w:r>
+      <w:proofErr w:type="spellStart"/>
+      <w:r>
+        <w:t>i</w:t>
+      </w:r>
+      <w:proofErr w:type="spellEnd"/>
+      <w:r>
+        <w:t xml:space="preserve">/p sequences, use </w:t>
+      </w:r>
+      <w:r>
+        <w:rPr>
+          <w:u w:val="single"/>
+        </w:rPr>
+        <w:t>attention mechanism</w:t>
+      </w:r>
+      <w:r>
+        <w:t xml:space="preserve"> to only </w:t>
+      </w:r>
+      <w:r>
+        <w:rPr>
+          <w:u w:val="single"/>
+        </w:rPr>
+        <w:t>select parts of input to predict next word</w:t>
+      </w:r>
+      <w:r>
+        <w:t xml:space="preserve"> in the response</w:t>
+      </w:r>
+    </w:p>
+    <w:p>
+      <w:r>
+        <w:t>Fine-tune LLMs on conversational datasets and pre-trained language models</w:t>
+      </w:r>
+    </w:p>
+    <w:p/>
+    <w:p>
+      <w:pPr>
+        <w:rPr>
+          <w:b/>
+          <w:bCs/>
+          <w:u w:val="single"/>
+        </w:rPr>
+      </w:pPr>
+      <w:r>
+        <w:rPr>
+          <w:b/>
+          <w:bCs/>
+          <w:u w:val="single"/>
+        </w:rPr>
+        <w:lastRenderedPageBreak/>
+        <w:t>DIALOGUE-STATE ARCHITECTURE</w:t>
+      </w:r>
+    </w:p>
+    <w:p>
+      <w:r>
+        <w:t>book hotel room</w:t>
+      </w:r>
+    </w:p>
+    <w:p>
+      <w:r>
+        <w:t>order food</w:t>
+      </w:r>
+    </w:p>
+    <w:p>
+      <w:r>
+        <w:t>schedule a call</w:t>
+      </w:r>
+    </w:p>
+    <w:p/>
+    <w:p>
+      <w:r>
+        <w:t>Architecture=</w:t>
+      </w:r>
+    </w:p>
+    <w:p>
+      <w:pPr>
+        <w:pStyle w:val="ListParagraph"/>
+        <w:numPr>
+          <w:ilvl w:val="0"/>
+          <w:numId w:val="4"/>
+        </w:numPr>
+        <w:rPr>
+          <w:b/>
+          <w:bCs/>
+        </w:rPr>
+      </w:pPr>
+      <w:r>
+        <w:rPr>
+          <w:b/>
+          <w:bCs/>
+        </w:rPr>
+        <w:t>AUTOMATIC SPEECH RECOGNITION (ASR)</w:t>
+      </w:r>
+    </w:p>
+    <w:p>
+      <w:r>
+        <w:t>It allows users to use their voices to speak with a dialogue system and transcribe spoken words into</w:t>
+      </w:r>
+      <w:r>
+        <w:t xml:space="preserve"> </w:t>
+      </w:r>
+      <w:r>
+        <w:t>written text.</w:t>
+      </w:r>
+    </w:p>
+    <w:p>
+      <w:pPr>
+        <w:pStyle w:val="ListParagraph"/>
+        <w:numPr>
+          <w:ilvl w:val="0"/>
+          <w:numId w:val="4"/>
+        </w:numPr>
+        <w:rPr>
+          <w:b/>
+          <w:bCs/>
+        </w:rPr>
+      </w:pPr>
+      <w:r>
+        <w:rPr>
+          <w:b/>
+          <w:bCs/>
+        </w:rPr>
+        <w:t>SPOKEN LANGUAGE UNDERSTANDING (SLU)</w:t>
+      </w:r>
+    </w:p>
+    <w:p>
+      <w:r>
+        <w:t>It interprets signs conveyed by speech signals to extract the semantics frame of user queries.</w:t>
+      </w:r>
+    </w:p>
+    <w:p>
+      <w:pPr>
+        <w:pStyle w:val="ListParagraph"/>
+        <w:numPr>
+          <w:ilvl w:val="0"/>
+          <w:numId w:val="4"/>
+        </w:numPr>
+        <w:rPr>
+          <w:b/>
+          <w:bCs/>
+        </w:rPr>
+      </w:pPr>
+      <w:r>
+        <w:rPr>
+          <w:b/>
+          <w:bCs/>
+        </w:rPr>
+        <w:t>NATURAL LANGUAGE UNDERSTANDING (NLU)</w:t>
+      </w:r>
+    </w:p>
+    <w:p>
+      <w:r>
+        <w:t>It interprets unstructured text to understand the context, semantic, intent, and sentiment of the text,</w:t>
+      </w:r>
+      <w:r>
+        <w:t xml:space="preserve"> </w:t>
+      </w:r>
+      <w:r>
+        <w:t>and then convert it to structured data.</w:t>
+      </w:r>
+    </w:p>
+    <w:p>
+      <w:pPr>
+        <w:pStyle w:val="ListParagraph"/>
+        <w:numPr>
+          <w:ilvl w:val="0"/>
+          <w:numId w:val="4"/>
+        </w:numPr>
+        <w:rPr>
+          <w:b/>
+          <w:bCs/>
+        </w:rPr>
+      </w:pPr>
+      <w:r>
+        <w:rPr>
+          <w:b/>
+          <w:bCs/>
+        </w:rPr>
+        <w:t>DIALOGUE STATE TRACKER (DST)</w:t>
+      </w:r>
+    </w:p>
+    <w:p>
+      <w:r>
+        <w:t>It identifies user intentions and requests given the dialogue context.</w:t>
+      </w:r>
+      <w:r>
+        <w:t xml:space="preserve"> </w:t>
+      </w:r>
+    </w:p>
+    <w:p>
+      <w:r>
+        <w:t>P(user intentions/dialogue content)</w:t>
+      </w:r>
+    </w:p>
+    <w:p>
+      <w:pPr>
+        <w:pStyle w:val="ListParagraph"/>
+        <w:numPr>
+          <w:ilvl w:val="0"/>
+          <w:numId w:val="2"/>
+        </w:numPr>
+        <w:rPr>
+          <w:b/>
+          <w:bCs/>
+        </w:rPr>
+      </w:pPr>
+      <w:r>
+        <w:rPr>
+          <w:b/>
+          <w:bCs/>
+        </w:rPr>
+        <w:t>DIALOGUE POLICY</w:t>
+      </w:r>
+    </w:p>
+    <w:p>
+      <w:r>
+        <w:t>It decides what and how a task-oriented dialog system will respond to user’s query.</w:t>
+      </w:r>
+    </w:p>
+    <w:p>
+      <w:pPr>
+        <w:pStyle w:val="ListParagraph"/>
+        <w:numPr>
+          <w:ilvl w:val="0"/>
+          <w:numId w:val="2"/>
+        </w:numPr>
+        <w:rPr>
+          <w:b/>
+          <w:bCs/>
+        </w:rPr>
+      </w:pPr>
+      <w:r>
+        <w:rPr>
+          <w:b/>
+          <w:bCs/>
+        </w:rPr>
+        <w:t>NATURAL LANGUAGE GENERATION (NLG)</w:t>
+      </w:r>
+    </w:p>
+    <w:p>
+      <w:r>
+        <w:t>It produces written or spoken utterances that seem much more natural.</w:t>
+      </w:r>
+    </w:p>
+    <w:p>
+      <w:pPr>
+        <w:pStyle w:val="ListParagraph"/>
+        <w:numPr>
+          <w:ilvl w:val="0"/>
+          <w:numId w:val="2"/>
+        </w:numPr>
+        <w:rPr>
+          <w:b/>
+          <w:bCs/>
+        </w:rPr>
+      </w:pPr>
+      <w:r>
+        <w:rPr>
+          <w:b/>
+          <w:bCs/>
+        </w:rPr>
+        <w:t>TEXT TO SPEECH (TTS)</w:t>
+      </w:r>
+    </w:p>
+    <w:p>
+      <w:r>
+        <w:t>I</w:t>
+      </w:r>
+      <w:r>
+        <w:t>t generates natural sounding voices.</w:t>
+      </w:r>
+    </w:p>
+    <w:p>
+      <w:r>
+        <w:rPr>
+          <w:noProof/>
+        </w:rPr>
+        <w:lastRenderedPageBreak/>
+        <w:drawing>
+          <wp:inline distT="0" distB="0" distL="0" distR="0" wp14:anchorId="13A3EC36" wp14:editId="7F309403">
+            <wp:extent cx="4528457" cy="2940593"/>
+            <wp:effectExtent l="0" t="0" r="5715" b="6350"/>
+            <wp:docPr id="1700633793" name="Picture 7"/>
+            <wp:cNvGraphicFramePr>
+              <a:graphicFrameLocks xmlns:a="http://schemas.openxmlformats.org/drawingml/2006/main" noChangeAspect="1"/>
+            </wp:cNvGraphicFramePr>
+            <a:graphic xmlns:a="http://schemas.openxmlformats.org/drawingml/2006/main">
+              <a:graphicData uri="http://schemas.openxmlformats.org/drawingml/2006/picture">
+                <pic:pic xmlns:pic="http://schemas.openxmlformats.org/drawingml/2006/picture">
+                  <pic:nvPicPr>
+                    <pic:cNvPr id="1700633793" name="Picture 1700633793"/>
+                    <pic:cNvPicPr/>
+                  </pic:nvPicPr>
+                  <pic:blipFill>
+                    <a:blip r:embed="rId11" cstate="print">
+                      <a:extLst>
+                        <a:ext uri="{28A0092B-C50C-407E-A947-70E740481C1C}">
+                          <a14:useLocalDpi xmlns:a14="http://schemas.microsoft.com/office/drawing/2010/main" val="0"/>
+                        </a:ext>
+                      </a:extLst>
+                    </a:blip>
+                    <a:stretch>
+                      <a:fillRect/>
+                    </a:stretch>
+                  </pic:blipFill>
+                  <pic:spPr>
+                    <a:xfrm>
+                      <a:off x="0" y="0"/>
+                      <a:ext cx="4585997" cy="2977957"/>
+                    </a:xfrm>
+                    <a:prstGeom prst="rect">
+                      <a:avLst/>
+                    </a:prstGeom>
+                  </pic:spPr>
+                </pic:pic>
+              </a:graphicData>
+            </a:graphic>
+          </wp:inline>
+        </w:drawing>
+      </w:r>
+    </w:p>
+    <w:p/>
+    <w:p>
+      <w:pPr>
+        <w:rPr>
+          <w:b/>
+          <w:bCs/>
+          <w:u w:val="single"/>
+        </w:rPr>
+      </w:pPr>
+      <w:r>
+        <w:rPr>
+          <w:b/>
+          <w:bCs/>
+          <w:u w:val="single"/>
+        </w:rPr>
+        <w:t xml:space="preserve">EVALUATING DIALOGUE SYSTEMS </w:t>
+      </w:r>
+    </w:p>
+    <w:p>
+      <w:r>
+        <w:t>Chatbot vs task-based</w:t>
+      </w:r>
+    </w:p>
+    <w:p>
+      <w:pPr>
+        <w:pStyle w:val="ListParagraph"/>
+        <w:numPr>
+          <w:ilvl w:val="0"/>
+          <w:numId w:val="5"/>
+        </w:numPr>
+      </w:pPr>
+      <w:r>
+        <w:t>Evaluating Chatbots</w:t>
+      </w:r>
+      <w:r>
+        <w:t xml:space="preserve"> (supervised)</w:t>
+      </w:r>
+    </w:p>
+    <w:p>
+      <w:pPr>
+        <w:pStyle w:val="ListParagraph"/>
+      </w:pPr>
+      <w:r>
+        <w:t>Recording raters interacting with real dialogue systems (participant evaluation)</w:t>
+      </w:r>
+    </w:p>
+    <w:p>
+      <w:pPr>
+        <w:pStyle w:val="ListParagraph"/>
+      </w:pPr>
+      <w:r>
+        <w:t>Reads transcripts of conversations (observer evaluation) b/w humans and chatbots</w:t>
+      </w:r>
+    </w:p>
+    <w:p/>
+    <w:p>
+      <w:r>
+        <w:rPr>
+          <w:noProof/>
+        </w:rPr>
+        <w:drawing>
+          <wp:inline distT="0" distB="0" distL="0" distR="0" wp14:anchorId="19AFBE95" wp14:editId="667BABA4">
+            <wp:extent cx="4512126" cy="2882265"/>
+            <wp:effectExtent l="0" t="0" r="0" b="635"/>
+            <wp:docPr id="740476806" name="Picture 8"/>
+            <wp:cNvGraphicFramePr>
+              <a:graphicFrameLocks xmlns:a="http://schemas.openxmlformats.org/drawingml/2006/main" noChangeAspect="1"/>
+            </wp:cNvGraphicFramePr>
+            <a:graphic xmlns:a="http://schemas.openxmlformats.org/drawingml/2006/main">
+              <a:graphicData uri="http://schemas.openxmlformats.org/drawingml/2006/picture">
+                <pic:pic xmlns:pic="http://schemas.openxmlformats.org/drawingml/2006/picture">
+                  <pic:nvPicPr>
+                    <pic:cNvPr id="740476806" name="Picture 740476806"/>
+                    <pic:cNvPicPr/>
+                  </pic:nvPicPr>
+                  <pic:blipFill>
+                    <a:blip r:embed="rId12" cstate="print">
+                      <a:extLst>
+                        <a:ext uri="{28A0092B-C50C-407E-A947-70E740481C1C}">
+                          <a14:useLocalDpi xmlns:a14="http://schemas.microsoft.com/office/drawing/2010/main" val="0"/>
+                        </a:ext>
+                      </a:extLst>
+                    </a:blip>
+                    <a:stretch>
+                      <a:fillRect/>
+                    </a:stretch>
+                  </pic:blipFill>
+                  <pic:spPr>
+                    <a:xfrm>
+                      <a:off x="0" y="0"/>
+                      <a:ext cx="4522860" cy="2889122"/>
+                    </a:xfrm>
+                    <a:prstGeom prst="rect">
+                      <a:avLst/>
+                    </a:prstGeom>
+                  </pic:spPr>
+                </pic:pic>
+              </a:graphicData>
+            </a:graphic>
+          </wp:inline>
+        </w:drawing>
+      </w:r>
+    </w:p>
+    <w:p>
+      <w:r>
+        <w:lastRenderedPageBreak/>
+        <w:t xml:space="preserve">Frame = structure encoding intentions to extract from user intentions </w:t>
+      </w:r>
+    </w:p>
+    <w:p>
+      <w:r>
+        <w:t xml:space="preserve">Consists of collection of slots </w:t>
+      </w:r>
+    </w:p>
+    <w:p/>
+    <w:p>
+      <w:pPr>
+        <w:pStyle w:val="ListParagraph"/>
+        <w:numPr>
+          <w:ilvl w:val="0"/>
+          <w:numId w:val="5"/>
+        </w:numPr>
+      </w:pPr>
+      <w:r>
+        <w:t>Evaluating Task-based Dialogue</w:t>
+      </w:r>
+      <w:r>
+        <w:t xml:space="preserve"> (unsupervised)</w:t>
+      </w:r>
+    </w:p>
+    <w:p>
+      <w:r>
+        <w:t>Measure performance of the system in the task:</w:t>
+      </w:r>
+    </w:p>
+    <w:p>
+      <w:r>
+        <w:t>Task completion</w:t>
+      </w:r>
+    </w:p>
+    <w:p>
+      <w:r>
+        <w:t xml:space="preserve">Dialogue duration </w:t>
+      </w:r>
+    </w:p>
+    <w:p>
+      <w:r>
+        <w:t xml:space="preserve">User satisfaction </w:t>
+      </w:r>
+    </w:p>
+    <w:p/>
+    <w:p>
+      <w:r>
+        <w:t xml:space="preserve">Metrics – </w:t>
+      </w:r>
+    </w:p>
+    <w:p>
+      <w:r>
+        <w:t>Quantitative (objective)</w:t>
+      </w:r>
+    </w:p>
+    <w:p>
+      <w:r>
+        <w:t>Qualitative (subjective)</w:t>
+      </w:r>
+    </w:p>
+    <w:p/>
+    <w:p/>
+    <w:p>
+      <w:pPr>
+        <w:rPr>
+          <w:b/>
+          <w:bCs/>
+          <w:u w:val="single"/>
+        </w:rPr>
+      </w:pPr>
+      <w:r>
+        <w:rPr>
+          <w:b/>
+          <w:bCs/>
+          <w:u w:val="single"/>
+        </w:rPr>
+        <w:t xml:space="preserve">OVERALL EVALUATION </w:t>
+      </w:r>
+    </w:p>
+    <w:p>
+      <w:r>
+        <w:t xml:space="preserve">Quantitative metrics could be </w:t>
+      </w:r>
+      <w:r>
+        <w:rPr>
+          <w:u w:val="single"/>
+        </w:rPr>
+        <w:t xml:space="preserve">computed from logs of interactions with </w:t>
+      </w:r>
+      <w:r>
+        <w:rPr>
+          <w:u w:val="single"/>
+        </w:rPr>
+        <w:t>users</w:t>
+      </w:r>
+      <w:r>
+        <w:t xml:space="preserve"> or</w:t>
+      </w:r>
+      <w:r>
+        <w:t xml:space="preserve"> </w:t>
+      </w:r>
+      <w:r>
+        <w:rPr>
+          <w:u w:val="single"/>
+        </w:rPr>
+        <w:t>calculated by raters</w:t>
+      </w:r>
+      <w:r>
+        <w:rPr>
+          <w:u w:val="single"/>
+        </w:rPr>
+        <w:t xml:space="preserve"> </w:t>
+      </w:r>
+      <w:r>
+        <w:rPr>
+          <w:u w:val="single"/>
+        </w:rPr>
+        <w:t>by reviewing logs</w:t>
+      </w:r>
+      <w:r>
+        <w:t>. Common quantitative metrics for overall system evaluation include:</w:t>
+      </w:r>
+    </w:p>
+    <w:p>
+      <w:pPr>
+        <w:pStyle w:val="ListParagraph"/>
+        <w:numPr>
+          <w:ilvl w:val="0"/>
+          <w:numId w:val="1"/>
+        </w:numPr>
+      </w:pPr>
+      <w:r>
+        <w:t>task succes</w:t>
+      </w:r>
+      <w:r>
+        <w:t>s</w:t>
+      </w:r>
+    </w:p>
+    <w:p>
+      <w:pPr>
+        <w:pStyle w:val="ListParagraph"/>
+        <w:numPr>
+          <w:ilvl w:val="0"/>
+          <w:numId w:val="1"/>
+        </w:numPr>
+      </w:pPr>
+      <w:r>
+        <w:t>task duration</w:t>
+      </w:r>
+    </w:p>
+    <w:p>
+      <w:pPr>
+        <w:pStyle w:val="ListParagraph"/>
+        <w:numPr>
+          <w:ilvl w:val="0"/>
+          <w:numId w:val="1"/>
+        </w:numPr>
+      </w:pPr>
+      <w:r>
+        <w:t xml:space="preserve">number of </w:t>
+      </w:r>
+      <w:r>
+        <w:t>systems</w:t>
+      </w:r>
+      <w:r>
+        <w:t xml:space="preserve"> turns</w:t>
+      </w:r>
+    </w:p>
+    <w:p>
+      <w:pPr>
+        <w:pStyle w:val="ListParagraph"/>
+        <w:numPr>
+          <w:ilvl w:val="0"/>
+          <w:numId w:val="1"/>
+        </w:numPr>
+      </w:pPr>
+      <w:r>
+        <w:t>number of user turns</w:t>
+      </w:r>
+    </w:p>
+    <w:p>
+      <w:pPr>
+        <w:pStyle w:val="ListParagraph"/>
+        <w:numPr>
+          <w:ilvl w:val="0"/>
+          <w:numId w:val="1"/>
+        </w:numPr>
+      </w:pPr>
+      <w:r>
+        <w:t>number of barge-ins</w:t>
+      </w:r>
+    </w:p>
+    <w:p>
+      <w:pPr>
+        <w:pStyle w:val="ListParagraph"/>
+        <w:numPr>
+          <w:ilvl w:val="0"/>
+          <w:numId w:val="1"/>
+        </w:numPr>
+      </w:pPr>
+      <w:r>
+        <w:t>number of repair utterances</w:t>
+      </w:r>
+    </w:p>
+    <w:p>
+      <w:pPr>
+        <w:pStyle w:val="ListParagraph"/>
+        <w:numPr>
+          <w:ilvl w:val="0"/>
+          <w:numId w:val="1"/>
+        </w:numPr>
+      </w:pPr>
+      <w:r>
+        <w:t>number of timeouts</w:t>
+      </w:r>
+    </w:p>
+    <w:p>
+      <w:pPr>
+        <w:pStyle w:val="ListParagraph"/>
+        <w:numPr>
+          <w:ilvl w:val="0"/>
+          <w:numId w:val="1"/>
+        </w:numPr>
+      </w:pPr>
+      <w:r>
+        <w:t>word error rate</w:t>
+      </w:r>
+    </w:p>
+    <w:p>
+      <w:pPr>
+        <w:pStyle w:val="ListParagraph"/>
+        <w:numPr>
+          <w:ilvl w:val="0"/>
+          <w:numId w:val="1"/>
+        </w:numPr>
+      </w:pPr>
+      <w:r>
+        <w:t>response latency</w:t>
+      </w:r>
+    </w:p>
+    <w:p/>
+    <w:p/>
+    <w:p>
+      <w:r>
+        <w:lastRenderedPageBreak/>
+        <w:t>Evaluating contribution to overall performance:</w:t>
+      </w:r>
+    </w:p>
+    <w:p>
+      <w:pPr>
+        <w:pStyle w:val="ListParagraph"/>
+        <w:numPr>
+          <w:ilvl w:val="0"/>
+          <w:numId w:val="1"/>
+        </w:numPr>
+      </w:pPr>
+      <w:r>
+        <w:t>Automatic Speech Recognition (ASR)</w:t>
+      </w:r>
+    </w:p>
+    <w:p>
+      <w:pPr>
+        <w:pStyle w:val="ListParagraph"/>
+        <w:numPr>
+          <w:ilvl w:val="1"/>
+          <w:numId w:val="1"/>
+        </w:numPr>
+      </w:pPr>
+      <w:r>
+        <w:t>Word Error Rate (WER)</w:t>
+      </w:r>
+    </w:p>
+    <w:p>
+      <w:r>
+        <w:rPr>
+          <w:noProof/>
+        </w:rPr>
+        <w:drawing>
+          <wp:inline distT="0" distB="0" distL="0" distR="0" wp14:anchorId="4C6C7EE8" wp14:editId="7772619A">
+            <wp:extent cx="4147457" cy="2355100"/>
+            <wp:effectExtent l="0" t="0" r="0" b="0"/>
+            <wp:docPr id="690253271" name="Picture 9"/>
+            <wp:cNvGraphicFramePr>
+              <a:graphicFrameLocks xmlns:a="http://schemas.openxmlformats.org/drawingml/2006/main" noChangeAspect="1"/>
+            </wp:cNvGraphicFramePr>
+            <a:graphic xmlns:a="http://schemas.openxmlformats.org/drawingml/2006/main">
+              <a:graphicData uri="http://schemas.openxmlformats.org/drawingml/2006/picture">
+                <pic:pic xmlns:pic="http://schemas.openxmlformats.org/drawingml/2006/picture">
+                  <pic:nvPicPr>
+                    <pic:cNvPr id="690253271" name="Picture 690253271"/>
+                    <pic:cNvPicPr/>
+                  </pic:nvPicPr>
+                  <pic:blipFill>
+                    <a:blip r:embed="rId13">
+                      <a:extLst>
+                        <a:ext uri="{28A0092B-C50C-407E-A947-70E740481C1C}">
+                          <a14:useLocalDpi xmlns:a14="http://schemas.microsoft.com/office/drawing/2010/main" val="0"/>
+                        </a:ext>
+                      </a:extLst>
+                    </a:blip>
+                    <a:stretch>
+                      <a:fillRect/>
+                    </a:stretch>
+                  </pic:blipFill>
+                  <pic:spPr>
+                    <a:xfrm>
+                      <a:off x="0" y="0"/>
+                      <a:ext cx="4173364" cy="2369811"/>
+                    </a:xfrm>
+                    <a:prstGeom prst="rect">
+                      <a:avLst/>
+                    </a:prstGeom>
+                  </pic:spPr>
+                </pic:pic>
+              </a:graphicData>
+            </a:graphic>
+          </wp:inline>
+        </w:drawing>
+      </w:r>
+    </w:p>
+    <w:p>
+      <w:pPr>
+        <w:pStyle w:val="ListParagraph"/>
+        <w:numPr>
+          <w:ilvl w:val="0"/>
+          <w:numId w:val="1"/>
+        </w:numPr>
+      </w:pPr>
+      <w:r>
+        <w:t>Natural Language Understanding (NLU)</w:t>
+      </w:r>
+    </w:p>
+    <w:p>
+      <w:pPr>
+        <w:pStyle w:val="ListParagraph"/>
+        <w:numPr>
+          <w:ilvl w:val="1"/>
+          <w:numId w:val="1"/>
+        </w:numPr>
+      </w:pPr>
+      <w:r>
+        <w:t xml:space="preserve">Comparing component’s o/p with reference representation </w:t>
+      </w:r>
+    </w:p>
+    <w:p>
+      <w:pPr>
+        <w:pStyle w:val="ListParagraph"/>
+        <w:numPr>
+          <w:ilvl w:val="1"/>
+          <w:numId w:val="1"/>
+        </w:numPr>
+      </w:pPr>
+      <w:r>
+        <w:rPr>
+          <w:u w:val="single"/>
+        </w:rPr>
+        <w:t>sentence accuracy</w:t>
+      </w:r>
+      <w:r>
+        <w:t xml:space="preserve"> if the output is a syntactic parse tree.</w:t>
+      </w:r>
+    </w:p>
+    <w:p>
+      <w:pPr>
+        <w:pStyle w:val="ListParagraph"/>
+        <w:numPr>
+          <w:ilvl w:val="1"/>
+          <w:numId w:val="1"/>
+        </w:numPr>
+      </w:pPr>
+      <w:r>
+        <w:rPr>
+          <w:u w:val="single"/>
+        </w:rPr>
+        <w:t>concept accuracy</w:t>
+      </w:r>
+      <w:r>
+        <w:t xml:space="preserve"> if the output is a semantic frame.</w:t>
+      </w:r>
+    </w:p>
+    <w:p>
+      <w:pPr>
+        <w:pStyle w:val="ListParagraph"/>
+        <w:numPr>
+          <w:ilvl w:val="1"/>
+          <w:numId w:val="1"/>
+        </w:numPr>
+      </w:pPr>
+      <w:r>
+        <w:t>confusion matrix, F1 measures, precision and recall if the output is classification (Intent</w:t>
+      </w:r>
+      <w:r>
+        <w:t xml:space="preserve"> </w:t>
+      </w:r>
+      <w:r>
+        <w:t>classification and entity extraction).</w:t>
+      </w:r>
+    </w:p>
+    <w:p>
+      <w:pPr>
+        <w:pStyle w:val="ListParagraph"/>
+        <w:numPr>
+          <w:ilvl w:val="0"/>
+          <w:numId w:val="1"/>
+        </w:numPr>
+      </w:pPr>
+      <w:r>
+        <w:t xml:space="preserve">Dialogue Management </w:t>
+      </w:r>
+    </w:p>
+    <w:p>
+      <w:pPr>
+        <w:pStyle w:val="ListParagraph"/>
+        <w:numPr>
+          <w:ilvl w:val="1"/>
+          <w:numId w:val="1"/>
+        </w:numPr>
+      </w:pPr>
+      <w:r>
+        <w:t xml:space="preserve">number of </w:t>
+      </w:r>
+      <w:proofErr w:type="gramStart"/>
+      <w:r>
+        <w:t>system</w:t>
+      </w:r>
+      <w:proofErr w:type="gramEnd"/>
+      <w:r>
+        <w:t xml:space="preserve"> </w:t>
+      </w:r>
+      <w:r>
+        <w:t>turns</w:t>
+      </w:r>
+    </w:p>
+    <w:p>
+      <w:pPr>
+        <w:pStyle w:val="ListParagraph"/>
+        <w:numPr>
+          <w:ilvl w:val="1"/>
+          <w:numId w:val="1"/>
+        </w:numPr>
+      </w:pPr>
+      <w:r>
+        <w:t>number of user turns</w:t>
+      </w:r>
+    </w:p>
+    <w:p>
+      <w:pPr>
+        <w:pStyle w:val="ListParagraph"/>
+        <w:numPr>
+          <w:ilvl w:val="1"/>
+          <w:numId w:val="1"/>
+        </w:numPr>
+      </w:pPr>
+      <w:r>
+        <w:t>percentage of successful repairs (correction rate)</w:t>
+      </w:r>
+    </w:p>
+    <w:p>
+      <w:pPr>
+        <w:pStyle w:val="ListParagraph"/>
+        <w:numPr>
+          <w:ilvl w:val="1"/>
+          <w:numId w:val="1"/>
+        </w:numPr>
+      </w:pPr>
+      <w:r>
+        <w:t>number of timeouts</w:t>
+      </w:r>
+    </w:p>
+    <w:p>
+      <w:pPr>
+        <w:pStyle w:val="ListParagraph"/>
+        <w:numPr>
+          <w:ilvl w:val="0"/>
+          <w:numId w:val="1"/>
+        </w:numPr>
+      </w:pPr>
+      <w:r>
+        <w:t>Natural Language Generation (NLG)</w:t>
+      </w:r>
+    </w:p>
+    <w:p>
+      <w:pPr>
+        <w:pStyle w:val="ListParagraph"/>
+        <w:numPr>
+          <w:ilvl w:val="1"/>
+          <w:numId w:val="1"/>
+        </w:numPr>
+      </w:pPr>
+      <w:r>
+        <w:rPr>
+          <w:u w:val="single"/>
+        </w:rPr>
+        <w:t>Task Performance</w:t>
+      </w:r>
+      <w:r>
+        <w:t xml:space="preserve"> - </w:t>
+      </w:r>
+      <w:r>
+        <w:t>in case the generated text assists in the performance of a task-based</w:t>
+      </w:r>
+      <w:r>
+        <w:t xml:space="preserve"> </w:t>
+      </w:r>
+      <w:r>
+        <w:t>dialogue.</w:t>
+      </w:r>
+    </w:p>
+    <w:p>
+      <w:pPr>
+        <w:pStyle w:val="ListParagraph"/>
+        <w:numPr>
+          <w:ilvl w:val="1"/>
+          <w:numId w:val="1"/>
+        </w:numPr>
+      </w:pPr>
+      <w:r>
+        <w:rPr>
+          <w:u w:val="single"/>
+        </w:rPr>
+        <w:t xml:space="preserve">Human ratings </w:t>
+      </w:r>
+      <w:r>
+        <w:t xml:space="preserve">- </w:t>
+      </w:r>
+      <w:r>
+        <w:t xml:space="preserve">Human ratings: raters assign rate to generated texts according to criteria such as </w:t>
+      </w:r>
+    </w:p>
+    <w:p>
+      <w:pPr>
+        <w:pStyle w:val="ListParagraph"/>
+        <w:numPr>
+          <w:ilvl w:val="2"/>
+          <w:numId w:val="1"/>
+        </w:numPr>
+      </w:pPr>
+      <w:r>
+        <w:t>quality,</w:t>
+      </w:r>
+      <w:r>
+        <w:t xml:space="preserve"> </w:t>
+      </w:r>
+      <w:r>
+        <w:t xml:space="preserve">coherence, </w:t>
+      </w:r>
+    </w:p>
+    <w:p>
+      <w:pPr>
+        <w:pStyle w:val="ListParagraph"/>
+        <w:numPr>
+          <w:ilvl w:val="2"/>
+          <w:numId w:val="1"/>
+        </w:numPr>
+      </w:pPr>
+      <w:r>
+        <w:t>content, organization, writing style,</w:t>
+      </w:r>
+    </w:p>
+    <w:p>
+      <w:pPr>
+        <w:pStyle w:val="ListParagraph"/>
+        <w:numPr>
+          <w:ilvl w:val="1"/>
+          <w:numId w:val="1"/>
+        </w:numPr>
+        <w:rPr>
+          <w:u w:val="single"/>
+        </w:rPr>
+      </w:pPr>
+      <w:r>
+        <w:rPr>
+          <w:u w:val="single"/>
+        </w:rPr>
+        <w:t>Comparisons</w:t>
+      </w:r>
+      <w:r>
+        <w:t xml:space="preserve"> – NLG text vs hand crafted texts</w:t>
+      </w:r>
+    </w:p>
+    <w:p>
+      <w:pPr>
+        <w:pStyle w:val="ListParagraph"/>
+        <w:ind w:left="1440"/>
+        <w:rPr>
+          <w:u w:val="single"/>
+        </w:rPr>
+      </w:pPr>
+    </w:p>
     <w:sectPr>
       <w:pgSz w:w="12240" w:h="15840"/>
       <w:pgMar w:top="1440" w:right="1440" w:bottom="1440" w:left="1440" w:header="720" w:footer="720" w:gutter="0"/>
@@ -28,6 +2531,543 @@
     </w:sectPr>
   </w:body>
 </w:document>
+</file>
+
+<file path=word/numbering.xml><?xml version="1.0" encoding="utf-8"?>
+<w:numbering xmlns:wpc="http://schemas.microsoft.com/office/word/2010/wordprocessingCanvas" xmlns:cx="http://schemas.microsoft.com/office/drawing/2014/chartex" xmlns:cx1="http://schemas.microsoft.com/office/drawing/2015/9/8/chartex" xmlns:cx2="http://schemas.microsoft.com/office/drawing/2015/10/21/chartex" xmlns:cx3="http://schemas.microsoft.com/office/drawing/2016/5/9/chartex" xmlns:cx4="http://schemas.microsoft.com/office/drawing/2016/5/10/chartex" xmlns:cx5="http://schemas.microsoft.com/office/drawing/2016/5/11/chartex" xmlns:cx6="http://schemas.microsoft.com/office/drawing/2016/5/12/chartex" xmlns:cx7="http://schemas.microsoft.com/office/drawing/2016/5/13/chartex" xmlns:cx8="http://schemas.microsoft.com/office/drawing/2016/5/14/chartex" xmlns:mc="http://schemas.openxmlformats.org/markup-compatibility/2006" xmlns:aink="http://schemas.microsoft.com/office/drawing/2016/ink" xmlns:am3d="http://schemas.microsoft.com/office/drawing/2017/model3d" xmlns:o="urn:schemas-microsoft-com:office:office" xmlns:oel="http://schemas.microsoft.com/office/2019/extlst" xmlns:r="http://schemas.openxmlformats.org/officeDocument/2006/relationships" xmlns:m="http://schemas.openxmlformats.org/officeDocument/2006/math" xmlns:v="urn:schemas-microsoft-com:vml" xmlns:wp14="http://schemas.microsoft.com/office/word/2010/wordprocessingDrawing" xmlns:wp="http://schemas.openxmlformats.org/drawingml/2006/wordprocessingDrawing" xmlns:w10="urn:schemas-microsoft-com:office:word" xmlns:w="http://schemas.openxmlformats.org/wordprocessingml/2006/main" xmlns:w14="http://schemas.microsoft.com/office/word/2010/wordml" xmlns:w15="http://schemas.microsoft.com/office/word/2012/wordml" xmlns:w16cex="http://schemas.microsoft.com/office/word/2018/wordml/cex" xmlns:w16cid="http://schemas.microsoft.com/office/word/2016/wordml/cid" xmlns:w16="http://schemas.microsoft.com/office/word/2018/wordml" xmlns:w16du="http://schemas.microsoft.com/office/word/2023/wordml/word16du" xmlns:w16sdtdh="http://schemas.microsoft.com/office/word/2020/wordml/sdtdatahash" xmlns:w16sdtfl="http://schemas.microsoft.com/office/word/2024/wordml/sdtformatlock" xmlns:w16se="http://schemas.microsoft.com/office/word/2015/wordml/symex" xmlns:wpg="http://schemas.microsoft.com/office/word/2010/wordprocessingGroup" xmlns:wpi="http://schemas.microsoft.com/office/word/2010/wordprocessingInk" xmlns:wne="http://schemas.microsoft.com/office/word/2006/wordml" xmlns:wps="http://schemas.microsoft.com/office/word/2010/wordprocessingShape" mc:Ignorable="w14 w15 w16se w16cid w16 w16cex w16sdtdh w16sdtfl w16du wp14">
+  <w:abstractNum w:abstractNumId="0" w15:restartNumberingAfterBreak="0">
+    <w:nsid w:val="1D9F040C"/>
+    <w:multiLevelType w:val="hybridMultilevel"/>
+    <w:tmpl w:val="FB06DE0C"/>
+    <w:lvl w:ilvl="0" w:tplc="0409000F">
+      <w:start w:val="1"/>
+      <w:numFmt w:val="decimal"/>
+      <w:lvlText w:val="%1."/>
+      <w:lvlJc w:val="left"/>
+      <w:pPr>
+        <w:ind w:left="720" w:hanging="360"/>
+      </w:pPr>
+      <w:rPr>
+        <w:rFonts w:hint="default"/>
+      </w:rPr>
+    </w:lvl>
+    <w:lvl w:ilvl="1" w:tplc="04090019" w:tentative="1">
+      <w:start w:val="1"/>
+      <w:numFmt w:val="lowerLetter"/>
+      <w:lvlText w:val="%2."/>
+      <w:lvlJc w:val="left"/>
+      <w:pPr>
+        <w:ind w:left="1440" w:hanging="360"/>
+      </w:pPr>
+    </w:lvl>
+    <w:lvl w:ilvl="2" w:tplc="0409001B" w:tentative="1">
+      <w:start w:val="1"/>
+      <w:numFmt w:val="lowerRoman"/>
+      <w:lvlText w:val="%3."/>
+      <w:lvlJc w:val="right"/>
+      <w:pPr>
+        <w:ind w:left="2160" w:hanging="180"/>
+      </w:pPr>
+    </w:lvl>
+    <w:lvl w:ilvl="3" w:tplc="0409000F" w:tentative="1">
+      <w:start w:val="1"/>
+      <w:numFmt w:val="decimal"/>
+      <w:lvlText w:val="%4."/>
+      <w:lvlJc w:val="left"/>
+      <w:pPr>
+        <w:ind w:left="2880" w:hanging="360"/>
+      </w:pPr>
+    </w:lvl>
+    <w:lvl w:ilvl="4" w:tplc="04090019" w:tentative="1">
+      <w:start w:val="1"/>
+      <w:numFmt w:val="lowerLetter"/>
+      <w:lvlText w:val="%5."/>
+      <w:lvlJc w:val="left"/>
+      <w:pPr>
+        <w:ind w:left="3600" w:hanging="360"/>
+      </w:pPr>
+    </w:lvl>
+    <w:lvl w:ilvl="5" w:tplc="0409001B" w:tentative="1">
+      <w:start w:val="1"/>
+      <w:numFmt w:val="lowerRoman"/>
+      <w:lvlText w:val="%6."/>
+      <w:lvlJc w:val="right"/>
+      <w:pPr>
+        <w:ind w:left="4320" w:hanging="180"/>
+      </w:pPr>
+    </w:lvl>
+    <w:lvl w:ilvl="6" w:tplc="0409000F" w:tentative="1">
+      <w:start w:val="1"/>
+      <w:numFmt w:val="decimal"/>
+      <w:lvlText w:val="%7."/>
+      <w:lvlJc w:val="left"/>
+      <w:pPr>
+        <w:ind w:left="5040" w:hanging="360"/>
+      </w:pPr>
+    </w:lvl>
+    <w:lvl w:ilvl="7" w:tplc="04090019" w:tentative="1">
+      <w:start w:val="1"/>
+      <w:numFmt w:val="lowerLetter"/>
+      <w:lvlText w:val="%8."/>
+      <w:lvlJc w:val="left"/>
+      <w:pPr>
+        <w:ind w:left="5760" w:hanging="360"/>
+      </w:pPr>
+    </w:lvl>
+    <w:lvl w:ilvl="8" w:tplc="0409001B" w:tentative="1">
+      <w:start w:val="1"/>
+      <w:numFmt w:val="lowerRoman"/>
+      <w:lvlText w:val="%9."/>
+      <w:lvlJc w:val="right"/>
+      <w:pPr>
+        <w:ind w:left="6480" w:hanging="180"/>
+      </w:pPr>
+    </w:lvl>
+  </w:abstractNum>
+  <w:abstractNum w:abstractNumId="1" w15:restartNumberingAfterBreak="0">
+    <w:nsid w:val="28B26384"/>
+    <w:multiLevelType w:val="hybridMultilevel"/>
+    <w:tmpl w:val="A5702EC8"/>
+    <w:lvl w:ilvl="0" w:tplc="D99AAC1E">
+      <w:start w:val="4"/>
+      <w:numFmt w:val="bullet"/>
+      <w:lvlText w:val="-"/>
+      <w:lvlJc w:val="left"/>
+      <w:pPr>
+        <w:ind w:left="720" w:hanging="360"/>
+      </w:pPr>
+      <w:rPr>
+        <w:rFonts w:ascii="Aptos" w:eastAsiaTheme="minorHAnsi" w:hAnsi="Aptos" w:cstheme="minorBidi" w:hint="default"/>
+      </w:rPr>
+    </w:lvl>
+    <w:lvl w:ilvl="1" w:tplc="04090003">
+      <w:start w:val="1"/>
+      <w:numFmt w:val="bullet"/>
+      <w:lvlText w:val="o"/>
+      <w:lvlJc w:val="left"/>
+      <w:pPr>
+        <w:ind w:left="1440" w:hanging="360"/>
+      </w:pPr>
+      <w:rPr>
+        <w:rFonts w:ascii="Courier New" w:hAnsi="Courier New" w:cs="Courier New" w:hint="default"/>
+      </w:rPr>
+    </w:lvl>
+    <w:lvl w:ilvl="2" w:tplc="04090005">
+      <w:start w:val="1"/>
+      <w:numFmt w:val="bullet"/>
+      <w:lvlText w:val=""/>
+      <w:lvlJc w:val="left"/>
+      <w:pPr>
+        <w:ind w:left="2160" w:hanging="360"/>
+      </w:pPr>
+      <w:rPr>
+        <w:rFonts w:ascii="Wingdings" w:hAnsi="Wingdings" w:hint="default"/>
+      </w:rPr>
+    </w:lvl>
+    <w:lvl w:ilvl="3" w:tplc="04090001" w:tentative="1">
+      <w:start w:val="1"/>
+      <w:numFmt w:val="bullet"/>
+      <w:lvlText w:val=""/>
+      <w:lvlJc w:val="left"/>
+      <w:pPr>
+        <w:ind w:left="2880" w:hanging="360"/>
+      </w:pPr>
+      <w:rPr>
+        <w:rFonts w:ascii="Symbol" w:hAnsi="Symbol" w:hint="default"/>
+      </w:rPr>
+    </w:lvl>
+    <w:lvl w:ilvl="4" w:tplc="04090003" w:tentative="1">
+      <w:start w:val="1"/>
+      <w:numFmt w:val="bullet"/>
+      <w:lvlText w:val="o"/>
+      <w:lvlJc w:val="left"/>
+      <w:pPr>
+        <w:ind w:left="3600" w:hanging="360"/>
+      </w:pPr>
+      <w:rPr>
+        <w:rFonts w:ascii="Courier New" w:hAnsi="Courier New" w:cs="Courier New" w:hint="default"/>
+      </w:rPr>
+    </w:lvl>
+    <w:lvl w:ilvl="5" w:tplc="04090005" w:tentative="1">
+      <w:start w:val="1"/>
+      <w:numFmt w:val="bullet"/>
+      <w:lvlText w:val=""/>
+      <w:lvlJc w:val="left"/>
+      <w:pPr>
+        <w:ind w:left="4320" w:hanging="360"/>
+      </w:pPr>
+      <w:rPr>
+        <w:rFonts w:ascii="Wingdings" w:hAnsi="Wingdings" w:hint="default"/>
+      </w:rPr>
+    </w:lvl>
+    <w:lvl w:ilvl="6" w:tplc="04090001" w:tentative="1">
+      <w:start w:val="1"/>
+      <w:numFmt w:val="bullet"/>
+      <w:lvlText w:val=""/>
+      <w:lvlJc w:val="left"/>
+      <w:pPr>
+        <w:ind w:left="5040" w:hanging="360"/>
+      </w:pPr>
+      <w:rPr>
+        <w:rFonts w:ascii="Symbol" w:hAnsi="Symbol" w:hint="default"/>
+      </w:rPr>
+    </w:lvl>
+    <w:lvl w:ilvl="7" w:tplc="04090003" w:tentative="1">
+      <w:start w:val="1"/>
+      <w:numFmt w:val="bullet"/>
+      <w:lvlText w:val="o"/>
+      <w:lvlJc w:val="left"/>
+      <w:pPr>
+        <w:ind w:left="5760" w:hanging="360"/>
+      </w:pPr>
+      <w:rPr>
+        <w:rFonts w:ascii="Courier New" w:hAnsi="Courier New" w:cs="Courier New" w:hint="default"/>
+      </w:rPr>
+    </w:lvl>
+    <w:lvl w:ilvl="8" w:tplc="04090005" w:tentative="1">
+      <w:start w:val="1"/>
+      <w:numFmt w:val="bullet"/>
+      <w:lvlText w:val=""/>
+      <w:lvlJc w:val="left"/>
+      <w:pPr>
+        <w:ind w:left="6480" w:hanging="360"/>
+      </w:pPr>
+      <w:rPr>
+        <w:rFonts w:ascii="Wingdings" w:hAnsi="Wingdings" w:hint="default"/>
+      </w:rPr>
+    </w:lvl>
+  </w:abstractNum>
+  <w:abstractNum w:abstractNumId="2" w15:restartNumberingAfterBreak="0">
+    <w:nsid w:val="2ED26A57"/>
+    <w:multiLevelType w:val="hybridMultilevel"/>
+    <w:tmpl w:val="1A30F318"/>
+    <w:lvl w:ilvl="0" w:tplc="0409000F">
+      <w:start w:val="1"/>
+      <w:numFmt w:val="decimal"/>
+      <w:lvlText w:val="%1."/>
+      <w:lvlJc w:val="left"/>
+      <w:pPr>
+        <w:ind w:left="720" w:hanging="360"/>
+      </w:pPr>
+      <w:rPr>
+        <w:rFonts w:hint="default"/>
+      </w:rPr>
+    </w:lvl>
+    <w:lvl w:ilvl="1" w:tplc="04090019" w:tentative="1">
+      <w:start w:val="1"/>
+      <w:numFmt w:val="lowerLetter"/>
+      <w:lvlText w:val="%2."/>
+      <w:lvlJc w:val="left"/>
+      <w:pPr>
+        <w:ind w:left="1440" w:hanging="360"/>
+      </w:pPr>
+    </w:lvl>
+    <w:lvl w:ilvl="2" w:tplc="0409001B" w:tentative="1">
+      <w:start w:val="1"/>
+      <w:numFmt w:val="lowerRoman"/>
+      <w:lvlText w:val="%3."/>
+      <w:lvlJc w:val="right"/>
+      <w:pPr>
+        <w:ind w:left="2160" w:hanging="180"/>
+      </w:pPr>
+    </w:lvl>
+    <w:lvl w:ilvl="3" w:tplc="0409000F" w:tentative="1">
+      <w:start w:val="1"/>
+      <w:numFmt w:val="decimal"/>
+      <w:lvlText w:val="%4."/>
+      <w:lvlJc w:val="left"/>
+      <w:pPr>
+        <w:ind w:left="2880" w:hanging="360"/>
+      </w:pPr>
+    </w:lvl>
+    <w:lvl w:ilvl="4" w:tplc="04090019" w:tentative="1">
+      <w:start w:val="1"/>
+      <w:numFmt w:val="lowerLetter"/>
+      <w:lvlText w:val="%5."/>
+      <w:lvlJc w:val="left"/>
+      <w:pPr>
+        <w:ind w:left="3600" w:hanging="360"/>
+      </w:pPr>
+    </w:lvl>
+    <w:lvl w:ilvl="5" w:tplc="0409001B" w:tentative="1">
+      <w:start w:val="1"/>
+      <w:numFmt w:val="lowerRoman"/>
+      <w:lvlText w:val="%6."/>
+      <w:lvlJc w:val="right"/>
+      <w:pPr>
+        <w:ind w:left="4320" w:hanging="180"/>
+      </w:pPr>
+    </w:lvl>
+    <w:lvl w:ilvl="6" w:tplc="0409000F" w:tentative="1">
+      <w:start w:val="1"/>
+      <w:numFmt w:val="decimal"/>
+      <w:lvlText w:val="%7."/>
+      <w:lvlJc w:val="left"/>
+      <w:pPr>
+        <w:ind w:left="5040" w:hanging="360"/>
+      </w:pPr>
+    </w:lvl>
+    <w:lvl w:ilvl="7" w:tplc="04090019" w:tentative="1">
+      <w:start w:val="1"/>
+      <w:numFmt w:val="lowerLetter"/>
+      <w:lvlText w:val="%8."/>
+      <w:lvlJc w:val="left"/>
+      <w:pPr>
+        <w:ind w:left="5760" w:hanging="360"/>
+      </w:pPr>
+    </w:lvl>
+    <w:lvl w:ilvl="8" w:tplc="0409001B" w:tentative="1">
+      <w:start w:val="1"/>
+      <w:numFmt w:val="lowerRoman"/>
+      <w:lvlText w:val="%9."/>
+      <w:lvlJc w:val="right"/>
+      <w:pPr>
+        <w:ind w:left="6480" w:hanging="180"/>
+      </w:pPr>
+    </w:lvl>
+  </w:abstractNum>
+  <w:abstractNum w:abstractNumId="3" w15:restartNumberingAfterBreak="0">
+    <w:nsid w:val="3A8543FF"/>
+    <w:multiLevelType w:val="hybridMultilevel"/>
+    <w:tmpl w:val="A31CFE26"/>
+    <w:lvl w:ilvl="0" w:tplc="E2800596">
+      <w:start w:val="1"/>
+      <w:numFmt w:val="bullet"/>
+      <w:lvlText w:val=""/>
+      <w:lvlJc w:val="left"/>
+      <w:pPr>
+        <w:ind w:left="720" w:hanging="360"/>
+      </w:pPr>
+      <w:rPr>
+        <w:rFonts w:ascii="Wingdings" w:eastAsiaTheme="minorHAnsi" w:hAnsi="Wingdings" w:cstheme="minorBidi" w:hint="default"/>
+      </w:rPr>
+    </w:lvl>
+    <w:lvl w:ilvl="1" w:tplc="04090003">
+      <w:start w:val="1"/>
+      <w:numFmt w:val="bullet"/>
+      <w:lvlText w:val="o"/>
+      <w:lvlJc w:val="left"/>
+      <w:pPr>
+        <w:ind w:left="1440" w:hanging="360"/>
+      </w:pPr>
+      <w:rPr>
+        <w:rFonts w:ascii="Courier New" w:hAnsi="Courier New" w:cs="Courier New" w:hint="default"/>
+      </w:rPr>
+    </w:lvl>
+    <w:lvl w:ilvl="2" w:tplc="04090005" w:tentative="1">
+      <w:start w:val="1"/>
+      <w:numFmt w:val="bullet"/>
+      <w:lvlText w:val=""/>
+      <w:lvlJc w:val="left"/>
+      <w:pPr>
+        <w:ind w:left="2160" w:hanging="360"/>
+      </w:pPr>
+      <w:rPr>
+        <w:rFonts w:ascii="Wingdings" w:hAnsi="Wingdings" w:hint="default"/>
+      </w:rPr>
+    </w:lvl>
+    <w:lvl w:ilvl="3" w:tplc="04090001" w:tentative="1">
+      <w:start w:val="1"/>
+      <w:numFmt w:val="bullet"/>
+      <w:lvlText w:val=""/>
+      <w:lvlJc w:val="left"/>
+      <w:pPr>
+        <w:ind w:left="2880" w:hanging="360"/>
+      </w:pPr>
+      <w:rPr>
+        <w:rFonts w:ascii="Symbol" w:hAnsi="Symbol" w:hint="default"/>
+      </w:rPr>
+    </w:lvl>
+    <w:lvl w:ilvl="4" w:tplc="04090003" w:tentative="1">
+      <w:start w:val="1"/>
+      <w:numFmt w:val="bullet"/>
+      <w:lvlText w:val="o"/>
+      <w:lvlJc w:val="left"/>
+      <w:pPr>
+        <w:ind w:left="3600" w:hanging="360"/>
+      </w:pPr>
+      <w:rPr>
+        <w:rFonts w:ascii="Courier New" w:hAnsi="Courier New" w:cs="Courier New" w:hint="default"/>
+      </w:rPr>
+    </w:lvl>
+    <w:lvl w:ilvl="5" w:tplc="04090005" w:tentative="1">
+      <w:start w:val="1"/>
+      <w:numFmt w:val="bullet"/>
+      <w:lvlText w:val=""/>
+      <w:lvlJc w:val="left"/>
+      <w:pPr>
+        <w:ind w:left="4320" w:hanging="360"/>
+      </w:pPr>
+      <w:rPr>
+        <w:rFonts w:ascii="Wingdings" w:hAnsi="Wingdings" w:hint="default"/>
+      </w:rPr>
+    </w:lvl>
+    <w:lvl w:ilvl="6" w:tplc="04090001" w:tentative="1">
+      <w:start w:val="1"/>
+      <w:numFmt w:val="bullet"/>
+      <w:lvlText w:val=""/>
+      <w:lvlJc w:val="left"/>
+      <w:pPr>
+        <w:ind w:left="5040" w:hanging="360"/>
+      </w:pPr>
+      <w:rPr>
+        <w:rFonts w:ascii="Symbol" w:hAnsi="Symbol" w:hint="default"/>
+      </w:rPr>
+    </w:lvl>
+    <w:lvl w:ilvl="7" w:tplc="04090003" w:tentative="1">
+      <w:start w:val="1"/>
+      <w:numFmt w:val="bullet"/>
+      <w:lvlText w:val="o"/>
+      <w:lvlJc w:val="left"/>
+      <w:pPr>
+        <w:ind w:left="5760" w:hanging="360"/>
+      </w:pPr>
+      <w:rPr>
+        <w:rFonts w:ascii="Courier New" w:hAnsi="Courier New" w:cs="Courier New" w:hint="default"/>
+      </w:rPr>
+    </w:lvl>
+    <w:lvl w:ilvl="8" w:tplc="04090005" w:tentative="1">
+      <w:start w:val="1"/>
+      <w:numFmt w:val="bullet"/>
+      <w:lvlText w:val=""/>
+      <w:lvlJc w:val="left"/>
+      <w:pPr>
+        <w:ind w:left="6480" w:hanging="360"/>
+      </w:pPr>
+      <w:rPr>
+        <w:rFonts w:ascii="Wingdings" w:hAnsi="Wingdings" w:hint="default"/>
+      </w:rPr>
+    </w:lvl>
+  </w:abstractNum>
+  <w:abstractNum w:abstractNumId="4" w15:restartNumberingAfterBreak="0">
+    <w:nsid w:val="5BE70643"/>
+    <w:multiLevelType w:val="hybridMultilevel"/>
+    <w:tmpl w:val="730C0F46"/>
+    <w:lvl w:ilvl="0" w:tplc="075CB998">
+      <w:start w:val="6"/>
+      <w:numFmt w:val="bullet"/>
+      <w:lvlText w:val=""/>
+      <w:lvlJc w:val="left"/>
+      <w:pPr>
+        <w:ind w:left="720" w:hanging="360"/>
+      </w:pPr>
+      <w:rPr>
+        <w:rFonts w:ascii="Wingdings" w:eastAsiaTheme="minorHAnsi" w:hAnsi="Wingdings" w:cstheme="minorBidi" w:hint="default"/>
+      </w:rPr>
+    </w:lvl>
+    <w:lvl w:ilvl="1" w:tplc="04090003" w:tentative="1">
+      <w:start w:val="1"/>
+      <w:numFmt w:val="bullet"/>
+      <w:lvlText w:val="o"/>
+      <w:lvlJc w:val="left"/>
+      <w:pPr>
+        <w:ind w:left="1440" w:hanging="360"/>
+      </w:pPr>
+      <w:rPr>
+        <w:rFonts w:ascii="Courier New" w:hAnsi="Courier New" w:cs="Courier New" w:hint="default"/>
+      </w:rPr>
+    </w:lvl>
+    <w:lvl w:ilvl="2" w:tplc="04090005" w:tentative="1">
+      <w:start w:val="1"/>
+      <w:numFmt w:val="bullet"/>
+      <w:lvlText w:val=""/>
+      <w:lvlJc w:val="left"/>
+      <w:pPr>
+        <w:ind w:left="2160" w:hanging="360"/>
+      </w:pPr>
+      <w:rPr>
+        <w:rFonts w:ascii="Wingdings" w:hAnsi="Wingdings" w:hint="default"/>
+      </w:rPr>
+    </w:lvl>
+    <w:lvl w:ilvl="3" w:tplc="04090001" w:tentative="1">
+      <w:start w:val="1"/>
+      <w:numFmt w:val="bullet"/>
+      <w:lvlText w:val=""/>
+      <w:lvlJc w:val="left"/>
+      <w:pPr>
+        <w:ind w:left="2880" w:hanging="360"/>
+      </w:pPr>
+      <w:rPr>
+        <w:rFonts w:ascii="Symbol" w:hAnsi="Symbol" w:hint="default"/>
+      </w:rPr>
+    </w:lvl>
+    <w:lvl w:ilvl="4" w:tplc="04090003" w:tentative="1">
+      <w:start w:val="1"/>
+      <w:numFmt w:val="bullet"/>
+      <w:lvlText w:val="o"/>
+      <w:lvlJc w:val="left"/>
+      <w:pPr>
+        <w:ind w:left="3600" w:hanging="360"/>
+      </w:pPr>
+      <w:rPr>
+        <w:rFonts w:ascii="Courier New" w:hAnsi="Courier New" w:cs="Courier New" w:hint="default"/>
+      </w:rPr>
+    </w:lvl>
+    <w:lvl w:ilvl="5" w:tplc="04090005" w:tentative="1">
+      <w:start w:val="1"/>
+      <w:numFmt w:val="bullet"/>
+      <w:lvlText w:val=""/>
+      <w:lvlJc w:val="left"/>
+      <w:pPr>
+        <w:ind w:left="4320" w:hanging="360"/>
+      </w:pPr>
+      <w:rPr>
+        <w:rFonts w:ascii="Wingdings" w:hAnsi="Wingdings" w:hint="default"/>
+      </w:rPr>
+    </w:lvl>
+    <w:lvl w:ilvl="6" w:tplc="04090001" w:tentative="1">
+      <w:start w:val="1"/>
+      <w:numFmt w:val="bullet"/>
+      <w:lvlText w:val=""/>
+      <w:lvlJc w:val="left"/>
+      <w:pPr>
+        <w:ind w:left="5040" w:hanging="360"/>
+      </w:pPr>
+      <w:rPr>
+        <w:rFonts w:ascii="Symbol" w:hAnsi="Symbol" w:hint="default"/>
+      </w:rPr>
+    </w:lvl>
+    <w:lvl w:ilvl="7" w:tplc="04090003" w:tentative="1">
+      <w:start w:val="1"/>
+      <w:numFmt w:val="bullet"/>
+      <w:lvlText w:val="o"/>
+      <w:lvlJc w:val="left"/>
+      <w:pPr>
+        <w:ind w:left="5760" w:hanging="360"/>
+      </w:pPr>
+      <w:rPr>
+        <w:rFonts w:ascii="Courier New" w:hAnsi="Courier New" w:cs="Courier New" w:hint="default"/>
+      </w:rPr>
+    </w:lvl>
+    <w:lvl w:ilvl="8" w:tplc="04090005" w:tentative="1">
+      <w:start w:val="1"/>
+      <w:numFmt w:val="bullet"/>
+      <w:lvlText w:val=""/>
+      <w:lvlJc w:val="left"/>
+      <w:pPr>
+        <w:ind w:left="6480" w:hanging="360"/>
+      </w:pPr>
+      <w:rPr>
+        <w:rFonts w:ascii="Wingdings" w:hAnsi="Wingdings" w:hint="default"/>
+      </w:rPr>
+    </w:lvl>
+  </w:abstractNum>
+  <w:num w:numId="1" w16cid:durableId="2128155905">
+    <w:abstractNumId w:val="1"/>
+  </w:num>
+  <w:num w:numId="2" w16cid:durableId="1474833670">
+    <w:abstractNumId w:val="2"/>
+  </w:num>
+  <w:num w:numId="3" w16cid:durableId="1075862393">
+    <w:abstractNumId w:val="3"/>
+  </w:num>
+  <w:num w:numId="4" w16cid:durableId="717364288">
+    <w:abstractNumId w:val="0"/>
+  </w:num>
+  <w:num w:numId="5" w16cid:durableId="739251637">
+    <w:abstractNumId w:val="4"/>
+  </w:num>
+</w:numbering>
 </file>
 
 <file path=word/styles.xml><?xml version="1.0" encoding="utf-8"?>

</xml_diff>